<commit_message>
add leaf scans and labels
</commit_message>
<xml_diff>
--- a/data_sheets/NxPxI_labels.docx
+++ b/data_sheets/NxPxI_labels.docx
@@ -35,14 +35,22 @@
                 <w:rFonts w:ascii="Arial" w:hAnsi="Arial" w:cs="Arial"/>
                 <w:sz w:val="32"/>
                 <w:szCs w:val="32"/>
-              </w:rPr>
-            </w:pPr>
-            <w:r>
-              <w:rPr>
-                <w:rFonts w:ascii="Arial" w:hAnsi="Arial" w:cs="Arial"/>
-                <w:color w:val="000000"/>
-                <w:sz w:val="32"/>
-                <w:szCs w:val="32"/>
+                <w14:glow w14:rad="635000">
+                  <w14:schemeClr w14:val="accent1">
+                    <w14:alpha w14:val="60000"/>
+                  </w14:schemeClr>
+                </w14:glow>
+              </w:rPr>
+            </w:pPr>
+            <w:r>
+              <w:rPr>
+                <w:rFonts w:ascii="Arial" w:hAnsi="Arial" w:cs="Arial"/>
+                <w:color w:val="FFFFFF" w:themeColor="background1"/>
+                <w:sz w:val="32"/>
+                <w:szCs w:val="32"/>
+                <w14:glow w14:rad="635000">
+                  <w14:srgbClr w14:val="7030A0"/>
+                </w14:glow>
               </w:rPr>
               <w:t>NI_0N_0P_B1_001</w:t>
             </w:r>
@@ -61,16 +69,23 @@
               <w:jc w:val="center"/>
               <w:rPr>
                 <w:rFonts w:ascii="Arial" w:hAnsi="Arial" w:cs="Arial"/>
-                <w:sz w:val="32"/>
-                <w:szCs w:val="32"/>
-              </w:rPr>
-            </w:pPr>
-            <w:r>
-              <w:rPr>
-                <w:rFonts w:ascii="Arial" w:hAnsi="Arial" w:cs="Arial"/>
-                <w:color w:val="000000"/>
-                <w:sz w:val="32"/>
-                <w:szCs w:val="32"/>
+                <w:color w:val="000000"/>
+                <w:sz w:val="32"/>
+                <w:szCs w:val="32"/>
+                <w14:glow w14:rad="635000">
+                  <w14:srgbClr w14:val="00B050"/>
+                </w14:glow>
+              </w:rPr>
+            </w:pPr>
+            <w:r>
+              <w:rPr>
+                <w:rFonts w:ascii="Arial" w:hAnsi="Arial" w:cs="Arial"/>
+                <w:color w:val="000000"/>
+                <w:sz w:val="32"/>
+                <w:szCs w:val="32"/>
+                <w14:glow w14:rad="635000">
+                  <w14:srgbClr w14:val="00B050"/>
+                </w14:glow>
               </w:rPr>
               <w:t>NI_0N_15P_B4_012</w:t>
             </w:r>
@@ -92,17 +107,23 @@
               <w:jc w:val="center"/>
               <w:rPr>
                 <w:rFonts w:ascii="Arial" w:hAnsi="Arial" w:cs="Arial"/>
-                <w:color w:val="000000"/>
-                <w:sz w:val="32"/>
-                <w:szCs w:val="32"/>
-              </w:rPr>
-            </w:pPr>
-            <w:r>
-              <w:rPr>
-                <w:rFonts w:ascii="Arial" w:hAnsi="Arial" w:cs="Arial"/>
-                <w:color w:val="000000"/>
-                <w:sz w:val="32"/>
-                <w:szCs w:val="32"/>
+                <w:color w:val="FFFFFF" w:themeColor="background1"/>
+                <w:sz w:val="32"/>
+                <w:szCs w:val="32"/>
+                <w14:glow w14:rad="635000">
+                  <w14:schemeClr w14:val="tx1"/>
+                </w14:glow>
+              </w:rPr>
+            </w:pPr>
+            <w:r>
+              <w:rPr>
+                <w:rFonts w:ascii="Arial" w:hAnsi="Arial" w:cs="Arial"/>
+                <w:color w:val="FFFFFF" w:themeColor="background1"/>
+                <w:sz w:val="32"/>
+                <w:szCs w:val="32"/>
+                <w14:glow w14:rad="635000">
+                  <w14:schemeClr w14:val="tx1"/>
+                </w14:glow>
               </w:rPr>
               <w:t>NI_0N_62P_B3_023</w:t>
             </w:r>
@@ -142,16 +163,23 @@
               <w:jc w:val="center"/>
               <w:rPr>
                 <w:rFonts w:ascii="Arial" w:hAnsi="Arial" w:cs="Arial"/>
-                <w:sz w:val="32"/>
-                <w:szCs w:val="32"/>
-              </w:rPr>
-            </w:pPr>
-            <w:r>
-              <w:rPr>
-                <w:rFonts w:ascii="Arial" w:hAnsi="Arial" w:cs="Arial"/>
-                <w:color w:val="000000"/>
-                <w:sz w:val="32"/>
-                <w:szCs w:val="32"/>
+                <w:color w:val="FFFFFF" w:themeColor="background1"/>
+                <w:sz w:val="32"/>
+                <w:szCs w:val="32"/>
+                <w14:glow w14:rad="635000">
+                  <w14:srgbClr w14:val="7030A0"/>
+                </w14:glow>
+              </w:rPr>
+            </w:pPr>
+            <w:r>
+              <w:rPr>
+                <w:rFonts w:ascii="Arial" w:hAnsi="Arial" w:cs="Arial"/>
+                <w:color w:val="FFFFFF" w:themeColor="background1"/>
+                <w:sz w:val="32"/>
+                <w:szCs w:val="32"/>
+                <w14:glow w14:rad="635000">
+                  <w14:srgbClr w14:val="7030A0"/>
+                </w14:glow>
               </w:rPr>
               <w:t>NI_0N_0P_B2_002</w:t>
             </w:r>
@@ -170,16 +198,23 @@
               <w:jc w:val="center"/>
               <w:rPr>
                 <w:rFonts w:ascii="Arial" w:hAnsi="Arial" w:cs="Arial"/>
-                <w:sz w:val="32"/>
-                <w:szCs w:val="32"/>
-              </w:rPr>
-            </w:pPr>
-            <w:r>
-              <w:rPr>
-                <w:rFonts w:ascii="Arial" w:hAnsi="Arial" w:cs="Arial"/>
-                <w:color w:val="000000"/>
-                <w:sz w:val="32"/>
-                <w:szCs w:val="32"/>
+                <w:color w:val="000000"/>
+                <w:sz w:val="32"/>
+                <w:szCs w:val="32"/>
+                <w14:glow w14:rad="635000">
+                  <w14:srgbClr w14:val="00B050"/>
+                </w14:glow>
+              </w:rPr>
+            </w:pPr>
+            <w:r>
+              <w:rPr>
+                <w:rFonts w:ascii="Arial" w:hAnsi="Arial" w:cs="Arial"/>
+                <w:color w:val="000000"/>
+                <w:sz w:val="32"/>
+                <w:szCs w:val="32"/>
+                <w14:glow w14:rad="635000">
+                  <w14:srgbClr w14:val="00B050"/>
+                </w14:glow>
               </w:rPr>
               <w:t>NI_0N_15P_B1_013</w:t>
             </w:r>
@@ -201,16 +236,23 @@
               <w:jc w:val="center"/>
               <w:rPr>
                 <w:rFonts w:ascii="Arial" w:hAnsi="Arial" w:cs="Arial"/>
-                <w:sz w:val="32"/>
-                <w:szCs w:val="32"/>
-              </w:rPr>
-            </w:pPr>
-            <w:r>
-              <w:rPr>
-                <w:rFonts w:ascii="Arial" w:hAnsi="Arial" w:cs="Arial"/>
-                <w:color w:val="000000"/>
-                <w:sz w:val="32"/>
-                <w:szCs w:val="32"/>
+                <w:color w:val="FFFFFF" w:themeColor="background1"/>
+                <w:sz w:val="32"/>
+                <w:szCs w:val="32"/>
+                <w14:glow w14:rad="635000">
+                  <w14:schemeClr w14:val="tx1"/>
+                </w14:glow>
+              </w:rPr>
+            </w:pPr>
+            <w:r>
+              <w:rPr>
+                <w:rFonts w:ascii="Arial" w:hAnsi="Arial" w:cs="Arial"/>
+                <w:color w:val="FFFFFF" w:themeColor="background1"/>
+                <w:sz w:val="32"/>
+                <w:szCs w:val="32"/>
+                <w14:glow w14:rad="635000">
+                  <w14:schemeClr w14:val="tx1"/>
+                </w14:glow>
               </w:rPr>
               <w:t>NI_0N_62P_B4_024</w:t>
             </w:r>
@@ -248,16 +290,23 @@
               <w:jc w:val="center"/>
               <w:rPr>
                 <w:rFonts w:ascii="Arial" w:hAnsi="Arial" w:cs="Arial"/>
-                <w:sz w:val="32"/>
-                <w:szCs w:val="32"/>
-              </w:rPr>
-            </w:pPr>
-            <w:r>
-              <w:rPr>
-                <w:rFonts w:ascii="Arial" w:hAnsi="Arial" w:cs="Arial"/>
-                <w:color w:val="000000"/>
-                <w:sz w:val="32"/>
-                <w:szCs w:val="32"/>
+                <w:color w:val="FFFFFF" w:themeColor="background1"/>
+                <w:sz w:val="32"/>
+                <w:szCs w:val="32"/>
+                <w14:glow w14:rad="635000">
+                  <w14:srgbClr w14:val="7030A0"/>
+                </w14:glow>
+              </w:rPr>
+            </w:pPr>
+            <w:r>
+              <w:rPr>
+                <w:rFonts w:ascii="Arial" w:hAnsi="Arial" w:cs="Arial"/>
+                <w:color w:val="FFFFFF" w:themeColor="background1"/>
+                <w:sz w:val="32"/>
+                <w:szCs w:val="32"/>
+                <w14:glow w14:rad="635000">
+                  <w14:srgbClr w14:val="7030A0"/>
+                </w14:glow>
               </w:rPr>
               <w:t>NI_0N_0P_B3_003</w:t>
             </w:r>
@@ -276,16 +325,23 @@
               <w:jc w:val="center"/>
               <w:rPr>
                 <w:rFonts w:ascii="Arial" w:hAnsi="Arial" w:cs="Arial"/>
-                <w:sz w:val="32"/>
-                <w:szCs w:val="32"/>
-              </w:rPr>
-            </w:pPr>
-            <w:r>
-              <w:rPr>
-                <w:rFonts w:ascii="Arial" w:hAnsi="Arial" w:cs="Arial"/>
-                <w:color w:val="000000"/>
-                <w:sz w:val="32"/>
-                <w:szCs w:val="32"/>
+                <w:color w:val="000000"/>
+                <w:sz w:val="32"/>
+                <w:szCs w:val="32"/>
+                <w14:glow w14:rad="635000">
+                  <w14:srgbClr w14:val="00B050"/>
+                </w14:glow>
+              </w:rPr>
+            </w:pPr>
+            <w:r>
+              <w:rPr>
+                <w:rFonts w:ascii="Arial" w:hAnsi="Arial" w:cs="Arial"/>
+                <w:color w:val="000000"/>
+                <w:sz w:val="32"/>
+                <w:szCs w:val="32"/>
+                <w14:glow w14:rad="635000">
+                  <w14:srgbClr w14:val="00B050"/>
+                </w14:glow>
               </w:rPr>
               <w:t>NI_0N_15P_B2_014</w:t>
             </w:r>
@@ -307,16 +363,23 @@
               <w:jc w:val="center"/>
               <w:rPr>
                 <w:rFonts w:ascii="Arial" w:hAnsi="Arial" w:cs="Arial"/>
-                <w:sz w:val="32"/>
-                <w:szCs w:val="32"/>
-              </w:rPr>
-            </w:pPr>
-            <w:r>
-              <w:rPr>
-                <w:rFonts w:ascii="Arial" w:hAnsi="Arial" w:cs="Arial"/>
-                <w:color w:val="000000"/>
-                <w:sz w:val="32"/>
-                <w:szCs w:val="32"/>
+                <w:color w:val="FFFFFF" w:themeColor="background1"/>
+                <w:sz w:val="32"/>
+                <w:szCs w:val="32"/>
+                <w14:glow w14:rad="635000">
+                  <w14:schemeClr w14:val="tx1"/>
+                </w14:glow>
+              </w:rPr>
+            </w:pPr>
+            <w:r>
+              <w:rPr>
+                <w:rFonts w:ascii="Arial" w:hAnsi="Arial" w:cs="Arial"/>
+                <w:color w:val="FFFFFF" w:themeColor="background1"/>
+                <w:sz w:val="32"/>
+                <w:szCs w:val="32"/>
+                <w14:glow w14:rad="635000">
+                  <w14:schemeClr w14:val="tx1"/>
+                </w14:glow>
               </w:rPr>
               <w:t>NI_0N_62P_B1_025</w:t>
             </w:r>
@@ -354,16 +417,23 @@
               <w:jc w:val="center"/>
               <w:rPr>
                 <w:rFonts w:ascii="Arial" w:hAnsi="Arial" w:cs="Arial"/>
-                <w:sz w:val="32"/>
-                <w:szCs w:val="32"/>
-              </w:rPr>
-            </w:pPr>
-            <w:r>
-              <w:rPr>
-                <w:rFonts w:ascii="Arial" w:hAnsi="Arial" w:cs="Arial"/>
-                <w:color w:val="000000"/>
-                <w:sz w:val="32"/>
-                <w:szCs w:val="32"/>
+                <w:color w:val="FFFFFF" w:themeColor="background1"/>
+                <w:sz w:val="32"/>
+                <w:szCs w:val="32"/>
+                <w14:glow w14:rad="635000">
+                  <w14:srgbClr w14:val="7030A0"/>
+                </w14:glow>
+              </w:rPr>
+            </w:pPr>
+            <w:r>
+              <w:rPr>
+                <w:rFonts w:ascii="Arial" w:hAnsi="Arial" w:cs="Arial"/>
+                <w:color w:val="FFFFFF" w:themeColor="background1"/>
+                <w:sz w:val="32"/>
+                <w:szCs w:val="32"/>
+                <w14:glow w14:rad="635000">
+                  <w14:srgbClr w14:val="7030A0"/>
+                </w14:glow>
               </w:rPr>
               <w:t>NI_0N_0P_B4_004</w:t>
             </w:r>
@@ -382,16 +452,23 @@
               <w:jc w:val="center"/>
               <w:rPr>
                 <w:rFonts w:ascii="Arial" w:hAnsi="Arial" w:cs="Arial"/>
-                <w:sz w:val="32"/>
-                <w:szCs w:val="32"/>
-              </w:rPr>
-            </w:pPr>
-            <w:r>
-              <w:rPr>
-                <w:rFonts w:ascii="Arial" w:hAnsi="Arial" w:cs="Arial"/>
-                <w:color w:val="000000"/>
-                <w:sz w:val="32"/>
-                <w:szCs w:val="32"/>
+                <w:color w:val="000000"/>
+                <w:sz w:val="32"/>
+                <w:szCs w:val="32"/>
+                <w14:glow w14:rad="635000">
+                  <w14:srgbClr w14:val="00B050"/>
+                </w14:glow>
+              </w:rPr>
+            </w:pPr>
+            <w:r>
+              <w:rPr>
+                <w:rFonts w:ascii="Arial" w:hAnsi="Arial" w:cs="Arial"/>
+                <w:color w:val="000000"/>
+                <w:sz w:val="32"/>
+                <w:szCs w:val="32"/>
+                <w14:glow w14:rad="635000">
+                  <w14:srgbClr w14:val="00B050"/>
+                </w14:glow>
               </w:rPr>
               <w:t>NI_0N_15P_B3_015</w:t>
             </w:r>
@@ -413,16 +490,20 @@
               <w:jc w:val="center"/>
               <w:rPr>
                 <w:rFonts w:ascii="Arial" w:hAnsi="Arial" w:cs="Arial"/>
-                <w:sz w:val="32"/>
-                <w:szCs w:val="32"/>
-              </w:rPr>
-            </w:pPr>
-            <w:r>
-              <w:rPr>
-                <w:rFonts w:ascii="Arial" w:hAnsi="Arial" w:cs="Arial"/>
-                <w:color w:val="000000"/>
-                <w:sz w:val="32"/>
-                <w:szCs w:val="32"/>
+                <w:color w:val="FFFFFF" w:themeColor="background1"/>
+                <w:sz w:val="32"/>
+                <w:szCs w:val="32"/>
+              </w:rPr>
+            </w:pPr>
+            <w:r>
+              <w:rPr>
+                <w:rFonts w:ascii="Arial" w:hAnsi="Arial" w:cs="Arial"/>
+                <w:color w:val="FFFFFF" w:themeColor="background1"/>
+                <w:sz w:val="32"/>
+                <w:szCs w:val="32"/>
+                <w14:glow w14:rad="635000">
+                  <w14:srgbClr w14:val="EE0000"/>
+                </w14:glow>
               </w:rPr>
               <w:t>NI_0N_93P_B2_026</w:t>
             </w:r>
@@ -460,16 +541,23 @@
               <w:jc w:val="center"/>
               <w:rPr>
                 <w:rFonts w:ascii="Arial" w:hAnsi="Arial" w:cs="Arial"/>
-                <w:sz w:val="32"/>
-                <w:szCs w:val="32"/>
-              </w:rPr>
-            </w:pPr>
-            <w:r>
-              <w:rPr>
-                <w:rFonts w:ascii="Arial" w:hAnsi="Arial" w:cs="Arial"/>
-                <w:color w:val="000000"/>
-                <w:sz w:val="32"/>
-                <w:szCs w:val="32"/>
+                <w:color w:val="FFFFFF" w:themeColor="background1"/>
+                <w:sz w:val="32"/>
+                <w:szCs w:val="32"/>
+                <w14:glow w14:rad="635000">
+                  <w14:srgbClr w14:val="7030A0"/>
+                </w14:glow>
+              </w:rPr>
+            </w:pPr>
+            <w:r>
+              <w:rPr>
+                <w:rFonts w:ascii="Arial" w:hAnsi="Arial" w:cs="Arial"/>
+                <w:color w:val="FFFFFF" w:themeColor="background1"/>
+                <w:sz w:val="32"/>
+                <w:szCs w:val="32"/>
+                <w14:glow w14:rad="635000">
+                  <w14:srgbClr w14:val="7030A0"/>
+                </w14:glow>
               </w:rPr>
               <w:t>NI_0N_0P_B1_005</w:t>
             </w:r>
@@ -498,6 +586,9 @@
                 <w:color w:val="000000"/>
                 <w:sz w:val="32"/>
                 <w:szCs w:val="32"/>
+                <w14:glow w14:rad="635000">
+                  <w14:srgbClr w14:val="FFFF00"/>
+                </w14:glow>
               </w:rPr>
               <w:t>NI_0N_31P_B4_016</w:t>
             </w:r>
@@ -519,16 +610,23 @@
               <w:jc w:val="center"/>
               <w:rPr>
                 <w:rFonts w:ascii="Arial" w:hAnsi="Arial" w:cs="Arial"/>
-                <w:sz w:val="32"/>
-                <w:szCs w:val="32"/>
-              </w:rPr>
-            </w:pPr>
-            <w:r>
-              <w:rPr>
-                <w:rFonts w:ascii="Arial" w:hAnsi="Arial" w:cs="Arial"/>
-                <w:color w:val="000000"/>
-                <w:sz w:val="32"/>
-                <w:szCs w:val="32"/>
+                <w:color w:val="FFFFFF" w:themeColor="background1"/>
+                <w:sz w:val="32"/>
+                <w:szCs w:val="32"/>
+                <w14:glow w14:rad="635000">
+                  <w14:srgbClr w14:val="EE0000"/>
+                </w14:glow>
+              </w:rPr>
+            </w:pPr>
+            <w:r>
+              <w:rPr>
+                <w:rFonts w:ascii="Arial" w:hAnsi="Arial" w:cs="Arial"/>
+                <w:color w:val="FFFFFF" w:themeColor="background1"/>
+                <w:sz w:val="32"/>
+                <w:szCs w:val="32"/>
+                <w14:glow w14:rad="635000">
+                  <w14:srgbClr w14:val="EE0000"/>
+                </w14:glow>
               </w:rPr>
               <w:t>NI_0N_93P_B3_027</w:t>
             </w:r>
@@ -566,16 +664,33 @@
               <w:jc w:val="center"/>
               <w:rPr>
                 <w:rFonts w:ascii="Arial" w:hAnsi="Arial" w:cs="Arial"/>
-                <w:sz w:val="32"/>
-                <w:szCs w:val="32"/>
-              </w:rPr>
-            </w:pPr>
-            <w:r>
-              <w:rPr>
-                <w:rFonts w:ascii="Arial" w:hAnsi="Arial" w:cs="Arial"/>
-                <w:color w:val="000000"/>
-                <w:sz w:val="32"/>
-                <w:szCs w:val="32"/>
+                <w:color w:val="FFFFFF" w:themeColor="background1"/>
+                <w:sz w:val="32"/>
+                <w:szCs w:val="32"/>
+                <w14:glow w14:rad="127000">
+                  <w14:srgbClr w14:val="FFFF00"/>
+                </w14:glow>
+                <w14:textOutline w14:w="9525" w14:cap="rnd" w14:cmpd="sng" w14:algn="ctr">
+                  <w14:noFill/>
+                  <w14:prstDash w14:val="solid"/>
+                  <w14:bevel/>
+                </w14:textOutline>
+              </w:rPr>
+            </w:pPr>
+            <w:r>
+              <w:rPr>
+                <w:rFonts w:ascii="Arial" w:hAnsi="Arial" w:cs="Arial"/>
+                <w:color w:val="FFFFFF" w:themeColor="background1"/>
+                <w:sz w:val="32"/>
+                <w:szCs w:val="32"/>
+                <w14:glow w14:rad="629488">
+                  <w14:srgbClr w14:val="0070C0"/>
+                </w14:glow>
+                <w14:textOutline w14:w="9525" w14:cap="rnd" w14:cmpd="sng" w14:algn="ctr">
+                  <w14:noFill/>
+                  <w14:prstDash w14:val="solid"/>
+                  <w14:bevel/>
+                </w14:textOutline>
               </w:rPr>
               <w:t>NI_0N_7.5P_B2_006</w:t>
             </w:r>
@@ -594,16 +709,23 @@
               <w:jc w:val="center"/>
               <w:rPr>
                 <w:rFonts w:ascii="Arial" w:hAnsi="Arial" w:cs="Arial"/>
-                <w:sz w:val="32"/>
-                <w:szCs w:val="32"/>
-              </w:rPr>
-            </w:pPr>
-            <w:r>
-              <w:rPr>
-                <w:rFonts w:ascii="Arial" w:hAnsi="Arial" w:cs="Arial"/>
-                <w:color w:val="000000"/>
-                <w:sz w:val="32"/>
-                <w:szCs w:val="32"/>
+                <w:color w:val="000000"/>
+                <w:sz w:val="32"/>
+                <w:szCs w:val="32"/>
+                <w14:glow w14:rad="635000">
+                  <w14:srgbClr w14:val="FFFF00"/>
+                </w14:glow>
+              </w:rPr>
+            </w:pPr>
+            <w:r>
+              <w:rPr>
+                <w:rFonts w:ascii="Arial" w:hAnsi="Arial" w:cs="Arial"/>
+                <w:color w:val="000000"/>
+                <w:sz w:val="32"/>
+                <w:szCs w:val="32"/>
+                <w14:glow w14:rad="635000">
+                  <w14:srgbClr w14:val="FFFF00"/>
+                </w14:glow>
               </w:rPr>
               <w:t>NI_0N_31P_B1_017</w:t>
             </w:r>
@@ -625,16 +747,23 @@
               <w:jc w:val="center"/>
               <w:rPr>
                 <w:rFonts w:ascii="Arial" w:hAnsi="Arial" w:cs="Arial"/>
-                <w:sz w:val="32"/>
-                <w:szCs w:val="32"/>
-              </w:rPr>
-            </w:pPr>
-            <w:r>
-              <w:rPr>
-                <w:rFonts w:ascii="Arial" w:hAnsi="Arial" w:cs="Arial"/>
-                <w:color w:val="000000"/>
-                <w:sz w:val="32"/>
-                <w:szCs w:val="32"/>
+                <w:color w:val="FFFFFF" w:themeColor="background1"/>
+                <w:sz w:val="32"/>
+                <w:szCs w:val="32"/>
+                <w14:glow w14:rad="635000">
+                  <w14:srgbClr w14:val="EE0000"/>
+                </w14:glow>
+              </w:rPr>
+            </w:pPr>
+            <w:r>
+              <w:rPr>
+                <w:rFonts w:ascii="Arial" w:hAnsi="Arial" w:cs="Arial"/>
+                <w:color w:val="FFFFFF" w:themeColor="background1"/>
+                <w:sz w:val="32"/>
+                <w:szCs w:val="32"/>
+                <w14:glow w14:rad="635000">
+                  <w14:srgbClr w14:val="EE0000"/>
+                </w14:glow>
               </w:rPr>
               <w:t>NI_0N_93P_B4_028</w:t>
             </w:r>
@@ -672,16 +801,33 @@
               <w:jc w:val="center"/>
               <w:rPr>
                 <w:rFonts w:ascii="Arial" w:hAnsi="Arial" w:cs="Arial"/>
-                <w:sz w:val="32"/>
-                <w:szCs w:val="32"/>
-              </w:rPr>
-            </w:pPr>
-            <w:r>
-              <w:rPr>
-                <w:rFonts w:ascii="Arial" w:hAnsi="Arial" w:cs="Arial"/>
-                <w:color w:val="000000"/>
-                <w:sz w:val="32"/>
-                <w:szCs w:val="32"/>
+                <w:color w:val="FFFFFF" w:themeColor="background1"/>
+                <w:sz w:val="32"/>
+                <w:szCs w:val="32"/>
+                <w14:glow w14:rad="629488">
+                  <w14:srgbClr w14:val="0070C0"/>
+                </w14:glow>
+                <w14:textOutline w14:w="9525" w14:cap="rnd" w14:cmpd="sng" w14:algn="ctr">
+                  <w14:noFill/>
+                  <w14:prstDash w14:val="solid"/>
+                  <w14:bevel/>
+                </w14:textOutline>
+              </w:rPr>
+            </w:pPr>
+            <w:r>
+              <w:rPr>
+                <w:rFonts w:ascii="Arial" w:hAnsi="Arial" w:cs="Arial"/>
+                <w:color w:val="FFFFFF" w:themeColor="background1"/>
+                <w:sz w:val="32"/>
+                <w:szCs w:val="32"/>
+                <w14:glow w14:rad="629488">
+                  <w14:srgbClr w14:val="0070C0"/>
+                </w14:glow>
+                <w14:textOutline w14:w="9525" w14:cap="rnd" w14:cmpd="sng" w14:algn="ctr">
+                  <w14:noFill/>
+                  <w14:prstDash w14:val="solid"/>
+                  <w14:bevel/>
+                </w14:textOutline>
               </w:rPr>
               <w:t>NI_0N_7.5P_B3_007</w:t>
             </w:r>
@@ -700,16 +846,23 @@
               <w:jc w:val="center"/>
               <w:rPr>
                 <w:rFonts w:ascii="Arial" w:hAnsi="Arial" w:cs="Arial"/>
-                <w:sz w:val="32"/>
-                <w:szCs w:val="32"/>
-              </w:rPr>
-            </w:pPr>
-            <w:r>
-              <w:rPr>
-                <w:rFonts w:ascii="Arial" w:hAnsi="Arial" w:cs="Arial"/>
-                <w:color w:val="000000"/>
-                <w:sz w:val="32"/>
-                <w:szCs w:val="32"/>
+                <w:color w:val="000000"/>
+                <w:sz w:val="32"/>
+                <w:szCs w:val="32"/>
+                <w14:glow w14:rad="635000">
+                  <w14:srgbClr w14:val="FFFF00"/>
+                </w14:glow>
+              </w:rPr>
+            </w:pPr>
+            <w:r>
+              <w:rPr>
+                <w:rFonts w:ascii="Arial" w:hAnsi="Arial" w:cs="Arial"/>
+                <w:color w:val="000000"/>
+                <w:sz w:val="32"/>
+                <w:szCs w:val="32"/>
+                <w14:glow w14:rad="635000">
+                  <w14:srgbClr w14:val="FFFF00"/>
+                </w14:glow>
               </w:rPr>
               <w:t>NI_0N_31P_B2_018</w:t>
             </w:r>
@@ -731,16 +884,23 @@
               <w:jc w:val="center"/>
               <w:rPr>
                 <w:rFonts w:ascii="Arial" w:hAnsi="Arial" w:cs="Arial"/>
-                <w:sz w:val="32"/>
-                <w:szCs w:val="32"/>
-              </w:rPr>
-            </w:pPr>
-            <w:r>
-              <w:rPr>
-                <w:rFonts w:ascii="Arial" w:hAnsi="Arial" w:cs="Arial"/>
-                <w:color w:val="000000"/>
-                <w:sz w:val="32"/>
-                <w:szCs w:val="32"/>
+                <w:color w:val="FFFFFF" w:themeColor="background1"/>
+                <w:sz w:val="32"/>
+                <w:szCs w:val="32"/>
+                <w14:glow w14:rad="635000">
+                  <w14:srgbClr w14:val="EE0000"/>
+                </w14:glow>
+              </w:rPr>
+            </w:pPr>
+            <w:r>
+              <w:rPr>
+                <w:rFonts w:ascii="Arial" w:hAnsi="Arial" w:cs="Arial"/>
+                <w:color w:val="FFFFFF" w:themeColor="background1"/>
+                <w:sz w:val="32"/>
+                <w:szCs w:val="32"/>
+                <w14:glow w14:rad="635000">
+                  <w14:srgbClr w14:val="EE0000"/>
+                </w14:glow>
               </w:rPr>
               <w:t>NI_0N_93P_B1_029</w:t>
             </w:r>
@@ -778,16 +938,33 @@
               <w:jc w:val="center"/>
               <w:rPr>
                 <w:rFonts w:ascii="Arial" w:hAnsi="Arial" w:cs="Arial"/>
-                <w:sz w:val="32"/>
-                <w:szCs w:val="32"/>
-              </w:rPr>
-            </w:pPr>
-            <w:r>
-              <w:rPr>
-                <w:rFonts w:ascii="Arial" w:hAnsi="Arial" w:cs="Arial"/>
-                <w:color w:val="000000"/>
-                <w:sz w:val="32"/>
-                <w:szCs w:val="32"/>
+                <w:color w:val="FFFFFF" w:themeColor="background1"/>
+                <w:sz w:val="32"/>
+                <w:szCs w:val="32"/>
+                <w14:glow w14:rad="629488">
+                  <w14:srgbClr w14:val="0070C0"/>
+                </w14:glow>
+                <w14:textOutline w14:w="9525" w14:cap="rnd" w14:cmpd="sng" w14:algn="ctr">
+                  <w14:noFill/>
+                  <w14:prstDash w14:val="solid"/>
+                  <w14:bevel/>
+                </w14:textOutline>
+              </w:rPr>
+            </w:pPr>
+            <w:r>
+              <w:rPr>
+                <w:rFonts w:ascii="Arial" w:hAnsi="Arial" w:cs="Arial"/>
+                <w:color w:val="FFFFFF" w:themeColor="background1"/>
+                <w:sz w:val="32"/>
+                <w:szCs w:val="32"/>
+                <w14:glow w14:rad="629488">
+                  <w14:srgbClr w14:val="0070C0"/>
+                </w14:glow>
+                <w14:textOutline w14:w="9525" w14:cap="rnd" w14:cmpd="sng" w14:algn="ctr">
+                  <w14:noFill/>
+                  <w14:prstDash w14:val="solid"/>
+                  <w14:bevel/>
+                </w14:textOutline>
               </w:rPr>
               <w:t>NI_0N_7.5P_B4_008</w:t>
             </w:r>
@@ -806,16 +983,23 @@
               <w:jc w:val="center"/>
               <w:rPr>
                 <w:rFonts w:ascii="Arial" w:hAnsi="Arial" w:cs="Arial"/>
-                <w:sz w:val="32"/>
-                <w:szCs w:val="32"/>
-              </w:rPr>
-            </w:pPr>
-            <w:r>
-              <w:rPr>
-                <w:rFonts w:ascii="Arial" w:hAnsi="Arial" w:cs="Arial"/>
-                <w:color w:val="000000"/>
-                <w:sz w:val="32"/>
-                <w:szCs w:val="32"/>
+                <w:color w:val="000000"/>
+                <w:sz w:val="32"/>
+                <w:szCs w:val="32"/>
+                <w14:glow w14:rad="635000">
+                  <w14:srgbClr w14:val="FFFF00"/>
+                </w14:glow>
+              </w:rPr>
+            </w:pPr>
+            <w:r>
+              <w:rPr>
+                <w:rFonts w:ascii="Arial" w:hAnsi="Arial" w:cs="Arial"/>
+                <w:color w:val="000000"/>
+                <w:sz w:val="32"/>
+                <w:szCs w:val="32"/>
+                <w14:glow w14:rad="635000">
+                  <w14:srgbClr w14:val="FFFF00"/>
+                </w14:glow>
               </w:rPr>
               <w:t>NI_0N_31P_B3_019</w:t>
             </w:r>
@@ -837,16 +1021,23 @@
               <w:jc w:val="center"/>
               <w:rPr>
                 <w:rFonts w:ascii="Arial" w:hAnsi="Arial" w:cs="Arial"/>
-                <w:sz w:val="32"/>
-                <w:szCs w:val="32"/>
-              </w:rPr>
-            </w:pPr>
-            <w:r>
-              <w:rPr>
-                <w:rFonts w:ascii="Arial" w:hAnsi="Arial" w:cs="Arial"/>
-                <w:color w:val="000000"/>
-                <w:sz w:val="32"/>
-                <w:szCs w:val="32"/>
+                <w:color w:val="FFFFFF" w:themeColor="background1"/>
+                <w:sz w:val="32"/>
+                <w:szCs w:val="32"/>
+                <w14:glow w14:rad="635000">
+                  <w14:srgbClr w14:val="EE0000"/>
+                </w14:glow>
+              </w:rPr>
+            </w:pPr>
+            <w:r>
+              <w:rPr>
+                <w:rFonts w:ascii="Arial" w:hAnsi="Arial" w:cs="Arial"/>
+                <w:color w:val="FFFFFF" w:themeColor="background1"/>
+                <w:sz w:val="32"/>
+                <w:szCs w:val="32"/>
+                <w14:glow w14:rad="635000">
+                  <w14:srgbClr w14:val="EE0000"/>
+                </w14:glow>
               </w:rPr>
               <w:t>NI_0N_93P_B2_030</w:t>
             </w:r>
@@ -884,16 +1075,33 @@
               <w:jc w:val="center"/>
               <w:rPr>
                 <w:rFonts w:ascii="Arial" w:hAnsi="Arial" w:cs="Arial"/>
-                <w:sz w:val="32"/>
-                <w:szCs w:val="32"/>
-              </w:rPr>
-            </w:pPr>
-            <w:r>
-              <w:rPr>
-                <w:rFonts w:ascii="Arial" w:hAnsi="Arial" w:cs="Arial"/>
-                <w:color w:val="000000"/>
-                <w:sz w:val="32"/>
-                <w:szCs w:val="32"/>
+                <w:color w:val="FFFFFF" w:themeColor="background1"/>
+                <w:sz w:val="32"/>
+                <w:szCs w:val="32"/>
+                <w14:glow w14:rad="629488">
+                  <w14:srgbClr w14:val="0070C0"/>
+                </w14:glow>
+                <w14:textOutline w14:w="9525" w14:cap="rnd" w14:cmpd="sng" w14:algn="ctr">
+                  <w14:noFill/>
+                  <w14:prstDash w14:val="solid"/>
+                  <w14:bevel/>
+                </w14:textOutline>
+              </w:rPr>
+            </w:pPr>
+            <w:r>
+              <w:rPr>
+                <w:rFonts w:ascii="Arial" w:hAnsi="Arial" w:cs="Arial"/>
+                <w:color w:val="FFFFFF" w:themeColor="background1"/>
+                <w:sz w:val="32"/>
+                <w:szCs w:val="32"/>
+                <w14:glow w14:rad="629488">
+                  <w14:srgbClr w14:val="0070C0"/>
+                </w14:glow>
+                <w14:textOutline w14:w="9525" w14:cap="rnd" w14:cmpd="sng" w14:algn="ctr">
+                  <w14:noFill/>
+                  <w14:prstDash w14:val="solid"/>
+                  <w14:bevel/>
+                </w14:textOutline>
               </w:rPr>
               <w:t>NI_0N_7.5P_B1_009</w:t>
             </w:r>
@@ -912,16 +1120,23 @@
               <w:jc w:val="center"/>
               <w:rPr>
                 <w:rFonts w:ascii="Arial" w:hAnsi="Arial" w:cs="Arial"/>
-                <w:sz w:val="32"/>
-                <w:szCs w:val="32"/>
-              </w:rPr>
-            </w:pPr>
-            <w:r>
-              <w:rPr>
-                <w:rFonts w:ascii="Arial" w:hAnsi="Arial" w:cs="Arial"/>
-                <w:color w:val="000000"/>
-                <w:sz w:val="32"/>
-                <w:szCs w:val="32"/>
+                <w:color w:val="000000"/>
+                <w:sz w:val="32"/>
+                <w:szCs w:val="32"/>
+                <w14:glow w14:rad="635000">
+                  <w14:srgbClr w14:val="FFFF00"/>
+                </w14:glow>
+              </w:rPr>
+            </w:pPr>
+            <w:r>
+              <w:rPr>
+                <w:rFonts w:ascii="Arial" w:hAnsi="Arial" w:cs="Arial"/>
+                <w:color w:val="000000"/>
+                <w:sz w:val="32"/>
+                <w:szCs w:val="32"/>
+                <w14:glow w14:rad="635000">
+                  <w14:srgbClr w14:val="FFFF00"/>
+                </w14:glow>
               </w:rPr>
               <w:t>NI_0N_31P_B4_020</w:t>
             </w:r>
@@ -936,21 +1151,23 @@
               <w:bottom w:val="single" w:sz="24" w:space="0" w:color="auto"/>
               <w:right w:val="single" w:sz="24" w:space="0" w:color="auto"/>
             </w:tcBorders>
-            <w:vAlign w:val="center"/>
-          </w:tcPr>
-          <w:p>
-            <w:pPr>
-              <w:jc w:val="center"/>
-              <w:rPr>
-                <w:rFonts w:ascii="Arial" w:hAnsi="Arial" w:cs="Arial"/>
-                <w:sz w:val="32"/>
-                <w:szCs w:val="32"/>
-              </w:rPr>
-            </w:pPr>
-            <w:r>
-              <w:rPr>
-                <w:rFonts w:ascii="Arial" w:hAnsi="Arial" w:cs="Arial"/>
-                <w:color w:val="000000"/>
+            <w:shd w:val="clear" w:color="auto" w:fill="7030A0"/>
+            <w:vAlign w:val="center"/>
+          </w:tcPr>
+          <w:p>
+            <w:pPr>
+              <w:jc w:val="center"/>
+              <w:rPr>
+                <w:rFonts w:ascii="Arial" w:hAnsi="Arial" w:cs="Arial"/>
+                <w:color w:val="FFFFFF" w:themeColor="background1"/>
+                <w:sz w:val="32"/>
+                <w:szCs w:val="32"/>
+              </w:rPr>
+            </w:pPr>
+            <w:r>
+              <w:rPr>
+                <w:rFonts w:ascii="Arial" w:hAnsi="Arial" w:cs="Arial"/>
+                <w:color w:val="FFFFFF" w:themeColor="background1"/>
                 <w:sz w:val="32"/>
                 <w:szCs w:val="32"/>
               </w:rPr>
@@ -990,16 +1207,33 @@
               <w:jc w:val="center"/>
               <w:rPr>
                 <w:rFonts w:ascii="Arial" w:hAnsi="Arial" w:cs="Arial"/>
-                <w:sz w:val="32"/>
-                <w:szCs w:val="32"/>
-              </w:rPr>
-            </w:pPr>
-            <w:r>
-              <w:rPr>
-                <w:rFonts w:ascii="Arial" w:hAnsi="Arial" w:cs="Arial"/>
-                <w:color w:val="000000"/>
-                <w:sz w:val="32"/>
-                <w:szCs w:val="32"/>
+                <w:color w:val="FFFFFF" w:themeColor="background1"/>
+                <w:sz w:val="32"/>
+                <w:szCs w:val="32"/>
+                <w14:glow w14:rad="629488">
+                  <w14:srgbClr w14:val="0070C0"/>
+                </w14:glow>
+                <w14:textOutline w14:w="9525" w14:cap="rnd" w14:cmpd="sng" w14:algn="ctr">
+                  <w14:noFill/>
+                  <w14:prstDash w14:val="solid"/>
+                  <w14:bevel/>
+                </w14:textOutline>
+              </w:rPr>
+            </w:pPr>
+            <w:r>
+              <w:rPr>
+                <w:rFonts w:ascii="Arial" w:hAnsi="Arial" w:cs="Arial"/>
+                <w:color w:val="FFFFFF" w:themeColor="background1"/>
+                <w:sz w:val="32"/>
+                <w:szCs w:val="32"/>
+                <w14:glow w14:rad="629488">
+                  <w14:srgbClr w14:val="0070C0"/>
+                </w14:glow>
+                <w14:textOutline w14:w="9525" w14:cap="rnd" w14:cmpd="sng" w14:algn="ctr">
+                  <w14:noFill/>
+                  <w14:prstDash w14:val="solid"/>
+                  <w14:bevel/>
+                </w14:textOutline>
               </w:rPr>
               <w:t>NI_0N_7.5P_B2_010</w:t>
             </w:r>
@@ -1020,14 +1254,22 @@
                 <w:rFonts w:ascii="Arial" w:hAnsi="Arial" w:cs="Arial"/>
                 <w:sz w:val="32"/>
                 <w:szCs w:val="32"/>
-              </w:rPr>
-            </w:pPr>
-            <w:r>
-              <w:rPr>
-                <w:rFonts w:ascii="Arial" w:hAnsi="Arial" w:cs="Arial"/>
-                <w:color w:val="000000"/>
-                <w:sz w:val="32"/>
-                <w:szCs w:val="32"/>
+                <w14:glow w14:rad="635000">
+                  <w14:schemeClr w14:val="accent1">
+                    <w14:alpha w14:val="60000"/>
+                  </w14:schemeClr>
+                </w14:glow>
+              </w:rPr>
+            </w:pPr>
+            <w:r>
+              <w:rPr>
+                <w:rFonts w:ascii="Arial" w:hAnsi="Arial" w:cs="Arial"/>
+                <w:color w:val="FFFFFF" w:themeColor="background1"/>
+                <w:sz w:val="32"/>
+                <w:szCs w:val="32"/>
+                <w14:glow w14:rad="635000">
+                  <w14:schemeClr w14:val="tx1"/>
+                </w14:glow>
               </w:rPr>
               <w:t>NI_0N_62P_B1_021</w:t>
             </w:r>
@@ -1042,21 +1284,23 @@
               <w:bottom w:val="single" w:sz="24" w:space="0" w:color="auto"/>
               <w:right w:val="single" w:sz="24" w:space="0" w:color="auto"/>
             </w:tcBorders>
-            <w:vAlign w:val="center"/>
-          </w:tcPr>
-          <w:p>
-            <w:pPr>
-              <w:jc w:val="center"/>
-              <w:rPr>
-                <w:rFonts w:ascii="Arial" w:hAnsi="Arial" w:cs="Arial"/>
-                <w:sz w:val="32"/>
-                <w:szCs w:val="32"/>
-              </w:rPr>
-            </w:pPr>
-            <w:r>
-              <w:rPr>
-                <w:rFonts w:ascii="Arial" w:hAnsi="Arial" w:cs="Arial"/>
-                <w:color w:val="000000"/>
+            <w:shd w:val="clear" w:color="auto" w:fill="7030A0"/>
+            <w:vAlign w:val="center"/>
+          </w:tcPr>
+          <w:p>
+            <w:pPr>
+              <w:jc w:val="center"/>
+              <w:rPr>
+                <w:rFonts w:ascii="Arial" w:hAnsi="Arial" w:cs="Arial"/>
+                <w:color w:val="FFFFFF" w:themeColor="background1"/>
+                <w:sz w:val="32"/>
+                <w:szCs w:val="32"/>
+              </w:rPr>
+            </w:pPr>
+            <w:r>
+              <w:rPr>
+                <w:rFonts w:ascii="Arial" w:hAnsi="Arial" w:cs="Arial"/>
+                <w:color w:val="FFFFFF" w:themeColor="background1"/>
                 <w:sz w:val="32"/>
                 <w:szCs w:val="32"/>
               </w:rPr>
@@ -1106,6 +1350,9 @@
                 <w:color w:val="000000"/>
                 <w:sz w:val="32"/>
                 <w:szCs w:val="32"/>
+                <w14:glow w14:rad="635000">
+                  <w14:srgbClr w14:val="00B050"/>
+                </w14:glow>
               </w:rPr>
               <w:t>NI_0N_15P_B3_011</w:t>
             </w:r>
@@ -1126,14 +1373,22 @@
                 <w:rFonts w:ascii="Arial" w:hAnsi="Arial" w:cs="Arial"/>
                 <w:sz w:val="32"/>
                 <w:szCs w:val="32"/>
-              </w:rPr>
-            </w:pPr>
-            <w:r>
-              <w:rPr>
-                <w:rFonts w:ascii="Arial" w:hAnsi="Arial" w:cs="Arial"/>
-                <w:color w:val="000000"/>
-                <w:sz w:val="32"/>
-                <w:szCs w:val="32"/>
+                <w14:glow w14:rad="635000">
+                  <w14:schemeClr w14:val="accent1">
+                    <w14:alpha w14:val="60000"/>
+                  </w14:schemeClr>
+                </w14:glow>
+              </w:rPr>
+            </w:pPr>
+            <w:r>
+              <w:rPr>
+                <w:rFonts w:ascii="Arial" w:hAnsi="Arial" w:cs="Arial"/>
+                <w:color w:val="FFFFFF" w:themeColor="background1"/>
+                <w:sz w:val="32"/>
+                <w:szCs w:val="32"/>
+                <w14:glow w14:rad="635000">
+                  <w14:schemeClr w14:val="tx1"/>
+                </w14:glow>
               </w:rPr>
               <w:t>NI_0N_62P_B2_022</w:t>
             </w:r>
@@ -1148,21 +1403,23 @@
               <w:bottom w:val="single" w:sz="24" w:space="0" w:color="auto"/>
               <w:right w:val="single" w:sz="24" w:space="0" w:color="auto"/>
             </w:tcBorders>
-            <w:vAlign w:val="center"/>
-          </w:tcPr>
-          <w:p>
-            <w:pPr>
-              <w:jc w:val="center"/>
-              <w:rPr>
-                <w:rFonts w:ascii="Arial" w:hAnsi="Arial" w:cs="Arial"/>
-                <w:sz w:val="32"/>
-                <w:szCs w:val="32"/>
-              </w:rPr>
-            </w:pPr>
-            <w:r>
-              <w:rPr>
-                <w:rFonts w:ascii="Arial" w:hAnsi="Arial" w:cs="Arial"/>
-                <w:color w:val="000000"/>
+            <w:shd w:val="clear" w:color="auto" w:fill="7030A0"/>
+            <w:vAlign w:val="center"/>
+          </w:tcPr>
+          <w:p>
+            <w:pPr>
+              <w:jc w:val="center"/>
+              <w:rPr>
+                <w:rFonts w:ascii="Arial" w:hAnsi="Arial" w:cs="Arial"/>
+                <w:color w:val="FFFFFF" w:themeColor="background1"/>
+                <w:sz w:val="32"/>
+                <w:szCs w:val="32"/>
+              </w:rPr>
+            </w:pPr>
+            <w:r>
+              <w:rPr>
+                <w:rFonts w:ascii="Arial" w:hAnsi="Arial" w:cs="Arial"/>
+                <w:color w:val="FFFFFF" w:themeColor="background1"/>
                 <w:sz w:val="32"/>
                 <w:szCs w:val="32"/>
               </w:rPr>
@@ -1195,21 +1452,23 @@
         <w:tc>
           <w:tcPr>
             <w:tcW w:w="3145" w:type="dxa"/>
-            <w:vAlign w:val="center"/>
-          </w:tcPr>
-          <w:p>
-            <w:pPr>
-              <w:jc w:val="center"/>
-              <w:rPr>
-                <w:rFonts w:ascii="Arial" w:hAnsi="Arial" w:cs="Arial"/>
-                <w:sz w:val="32"/>
-                <w:szCs w:val="32"/>
-              </w:rPr>
-            </w:pPr>
-            <w:r>
-              <w:rPr>
-                <w:rFonts w:ascii="Arial" w:hAnsi="Arial" w:cs="Arial"/>
-                <w:color w:val="000000"/>
+            <w:shd w:val="clear" w:color="auto" w:fill="7030A0"/>
+            <w:vAlign w:val="center"/>
+          </w:tcPr>
+          <w:p>
+            <w:pPr>
+              <w:jc w:val="center"/>
+              <w:rPr>
+                <w:rFonts w:ascii="Arial" w:hAnsi="Arial" w:cs="Arial"/>
+                <w:color w:val="FFFFFF" w:themeColor="background1"/>
+                <w:sz w:val="32"/>
+                <w:szCs w:val="32"/>
+              </w:rPr>
+            </w:pPr>
+            <w:r>
+              <w:rPr>
+                <w:rFonts w:ascii="Arial" w:hAnsi="Arial" w:cs="Arial"/>
+                <w:color w:val="FFFFFF" w:themeColor="background1"/>
                 <w:sz w:val="32"/>
                 <w:szCs w:val="32"/>
               </w:rPr>
@@ -1224,6 +1483,7 @@
             <w:tcBorders>
               <w:right w:val="single" w:sz="24" w:space="0" w:color="auto"/>
             </w:tcBorders>
+            <w:shd w:val="clear" w:color="auto" w:fill="00B050"/>
             <w:vAlign w:val="center"/>
           </w:tcPr>
           <w:p>
@@ -1255,21 +1515,23 @@
               <w:bottom w:val="single" w:sz="24" w:space="0" w:color="auto"/>
               <w:right w:val="single" w:sz="24" w:space="0" w:color="auto"/>
             </w:tcBorders>
-            <w:vAlign w:val="center"/>
-          </w:tcPr>
-          <w:p>
-            <w:pPr>
-              <w:jc w:val="center"/>
-              <w:rPr>
-                <w:rFonts w:ascii="Arial" w:hAnsi="Arial" w:cs="Arial"/>
-                <w:sz w:val="32"/>
-                <w:szCs w:val="32"/>
-              </w:rPr>
-            </w:pPr>
-            <w:r>
-              <w:rPr>
-                <w:rFonts w:ascii="Arial" w:hAnsi="Arial" w:cs="Arial"/>
-                <w:color w:val="000000"/>
+            <w:shd w:val="clear" w:color="auto" w:fill="EE0000"/>
+            <w:vAlign w:val="center"/>
+          </w:tcPr>
+          <w:p>
+            <w:pPr>
+              <w:jc w:val="center"/>
+              <w:rPr>
+                <w:rFonts w:ascii="Arial" w:hAnsi="Arial" w:cs="Arial"/>
+                <w:color w:val="000000" w:themeColor="text1"/>
+                <w:sz w:val="32"/>
+                <w:szCs w:val="32"/>
+              </w:rPr>
+            </w:pPr>
+            <w:r>
+              <w:rPr>
+                <w:rFonts w:ascii="Arial" w:hAnsi="Arial" w:cs="Arial"/>
+                <w:color w:val="000000" w:themeColor="text1"/>
                 <w:sz w:val="32"/>
                 <w:szCs w:val="32"/>
               </w:rPr>
@@ -1302,21 +1564,23 @@
         <w:tc>
           <w:tcPr>
             <w:tcW w:w="3145" w:type="dxa"/>
-            <w:vAlign w:val="center"/>
-          </w:tcPr>
-          <w:p>
-            <w:pPr>
-              <w:jc w:val="center"/>
-              <w:rPr>
-                <w:rFonts w:ascii="Arial" w:hAnsi="Arial" w:cs="Arial"/>
-                <w:sz w:val="32"/>
-                <w:szCs w:val="32"/>
-              </w:rPr>
-            </w:pPr>
-            <w:r>
-              <w:rPr>
-                <w:rFonts w:ascii="Arial" w:hAnsi="Arial" w:cs="Arial"/>
-                <w:color w:val="000000"/>
+            <w:shd w:val="clear" w:color="auto" w:fill="7030A0"/>
+            <w:vAlign w:val="center"/>
+          </w:tcPr>
+          <w:p>
+            <w:pPr>
+              <w:jc w:val="center"/>
+              <w:rPr>
+                <w:rFonts w:ascii="Arial" w:hAnsi="Arial" w:cs="Arial"/>
+                <w:color w:val="FFFFFF" w:themeColor="background1"/>
+                <w:sz w:val="32"/>
+                <w:szCs w:val="32"/>
+              </w:rPr>
+            </w:pPr>
+            <w:r>
+              <w:rPr>
+                <w:rFonts w:ascii="Arial" w:hAnsi="Arial" w:cs="Arial"/>
+                <w:color w:val="FFFFFF" w:themeColor="background1"/>
                 <w:sz w:val="32"/>
                 <w:szCs w:val="32"/>
               </w:rPr>
@@ -1330,6 +1594,7 @@
             <w:tcBorders>
               <w:right w:val="single" w:sz="24" w:space="0" w:color="auto"/>
             </w:tcBorders>
+            <w:shd w:val="clear" w:color="auto" w:fill="FFFF00"/>
             <w:vAlign w:val="center"/>
           </w:tcPr>
           <w:p>
@@ -1361,21 +1626,23 @@
               <w:bottom w:val="single" w:sz="24" w:space="0" w:color="auto"/>
               <w:right w:val="single" w:sz="24" w:space="0" w:color="auto"/>
             </w:tcBorders>
-            <w:vAlign w:val="center"/>
-          </w:tcPr>
-          <w:p>
-            <w:pPr>
-              <w:jc w:val="center"/>
-              <w:rPr>
-                <w:rFonts w:ascii="Arial" w:hAnsi="Arial" w:cs="Arial"/>
-                <w:sz w:val="32"/>
-                <w:szCs w:val="32"/>
-              </w:rPr>
-            </w:pPr>
-            <w:r>
-              <w:rPr>
-                <w:rFonts w:ascii="Arial" w:hAnsi="Arial" w:cs="Arial"/>
-                <w:color w:val="000000"/>
+            <w:shd w:val="clear" w:color="auto" w:fill="EE0000"/>
+            <w:vAlign w:val="center"/>
+          </w:tcPr>
+          <w:p>
+            <w:pPr>
+              <w:jc w:val="center"/>
+              <w:rPr>
+                <w:rFonts w:ascii="Arial" w:hAnsi="Arial" w:cs="Arial"/>
+                <w:color w:val="000000" w:themeColor="text1"/>
+                <w:sz w:val="32"/>
+                <w:szCs w:val="32"/>
+              </w:rPr>
+            </w:pPr>
+            <w:r>
+              <w:rPr>
+                <w:rFonts w:ascii="Arial" w:hAnsi="Arial" w:cs="Arial"/>
+                <w:color w:val="000000" w:themeColor="text1"/>
                 <w:sz w:val="32"/>
                 <w:szCs w:val="32"/>
               </w:rPr>
@@ -1408,23 +1675,31 @@
         <w:tc>
           <w:tcPr>
             <w:tcW w:w="3145" w:type="dxa"/>
-            <w:vAlign w:val="center"/>
-          </w:tcPr>
-          <w:p>
-            <w:pPr>
-              <w:jc w:val="center"/>
-              <w:rPr>
-                <w:rFonts w:ascii="Arial" w:hAnsi="Arial" w:cs="Arial"/>
-                <w:sz w:val="32"/>
-                <w:szCs w:val="32"/>
-              </w:rPr>
-            </w:pPr>
-            <w:r>
-              <w:rPr>
-                <w:rFonts w:ascii="Arial" w:hAnsi="Arial" w:cs="Arial"/>
-                <w:color w:val="000000"/>
-                <w:sz w:val="32"/>
-                <w:szCs w:val="32"/>
+            <w:shd w:val="clear" w:color="auto" w:fill="0070C0"/>
+            <w:vAlign w:val="center"/>
+          </w:tcPr>
+          <w:p>
+            <w:pPr>
+              <w:jc w:val="center"/>
+              <w:rPr>
+                <w:rFonts w:ascii="Arial" w:hAnsi="Arial" w:cs="Arial"/>
+                <w:color w:val="FFFFFF" w:themeColor="background1"/>
+                <w:sz w:val="32"/>
+                <w:szCs w:val="32"/>
+                <w14:glow w14:rad="0">
+                  <w14:srgbClr w14:val="0070C0"/>
+                </w14:glow>
+              </w:rPr>
+            </w:pPr>
+            <w:r>
+              <w:rPr>
+                <w:rFonts w:ascii="Arial" w:hAnsi="Arial" w:cs="Arial"/>
+                <w:color w:val="FFFFFF" w:themeColor="background1"/>
+                <w:sz w:val="32"/>
+                <w:szCs w:val="32"/>
+                <w14:glow w14:rad="0">
+                  <w14:srgbClr w14:val="0070C0"/>
+                </w14:glow>
               </w:rPr>
               <w:t>NI_210N_7.5P_B4_036</w:t>
             </w:r>
@@ -1436,6 +1711,7 @@
             <w:tcBorders>
               <w:right w:val="single" w:sz="24" w:space="0" w:color="auto"/>
             </w:tcBorders>
+            <w:shd w:val="clear" w:color="auto" w:fill="FFFF00"/>
             <w:vAlign w:val="center"/>
           </w:tcPr>
           <w:p>
@@ -1467,21 +1743,23 @@
               <w:bottom w:val="single" w:sz="24" w:space="0" w:color="auto"/>
               <w:right w:val="single" w:sz="24" w:space="0" w:color="auto"/>
             </w:tcBorders>
-            <w:vAlign w:val="center"/>
-          </w:tcPr>
-          <w:p>
-            <w:pPr>
-              <w:jc w:val="center"/>
-              <w:rPr>
-                <w:rFonts w:ascii="Arial" w:hAnsi="Arial" w:cs="Arial"/>
-                <w:sz w:val="32"/>
-                <w:szCs w:val="32"/>
-              </w:rPr>
-            </w:pPr>
-            <w:r>
-              <w:rPr>
-                <w:rFonts w:ascii="Arial" w:hAnsi="Arial" w:cs="Arial"/>
-                <w:color w:val="000000"/>
+            <w:shd w:val="clear" w:color="auto" w:fill="EE0000"/>
+            <w:vAlign w:val="center"/>
+          </w:tcPr>
+          <w:p>
+            <w:pPr>
+              <w:jc w:val="center"/>
+              <w:rPr>
+                <w:rFonts w:ascii="Arial" w:hAnsi="Arial" w:cs="Arial"/>
+                <w:color w:val="000000" w:themeColor="text1"/>
+                <w:sz w:val="32"/>
+                <w:szCs w:val="32"/>
+              </w:rPr>
+            </w:pPr>
+            <w:r>
+              <w:rPr>
+                <w:rFonts w:ascii="Arial" w:hAnsi="Arial" w:cs="Arial"/>
+                <w:color w:val="000000" w:themeColor="text1"/>
                 <w:sz w:val="32"/>
                 <w:szCs w:val="32"/>
               </w:rPr>
@@ -1514,23 +1792,31 @@
         <w:tc>
           <w:tcPr>
             <w:tcW w:w="3145" w:type="dxa"/>
-            <w:vAlign w:val="center"/>
-          </w:tcPr>
-          <w:p>
-            <w:pPr>
-              <w:jc w:val="center"/>
-              <w:rPr>
-                <w:rFonts w:ascii="Arial" w:hAnsi="Arial" w:cs="Arial"/>
-                <w:sz w:val="32"/>
-                <w:szCs w:val="32"/>
-              </w:rPr>
-            </w:pPr>
-            <w:r>
-              <w:rPr>
-                <w:rFonts w:ascii="Arial" w:hAnsi="Arial" w:cs="Arial"/>
-                <w:color w:val="000000"/>
-                <w:sz w:val="32"/>
-                <w:szCs w:val="32"/>
+            <w:shd w:val="clear" w:color="auto" w:fill="0070C0"/>
+            <w:vAlign w:val="center"/>
+          </w:tcPr>
+          <w:p>
+            <w:pPr>
+              <w:jc w:val="center"/>
+              <w:rPr>
+                <w:rFonts w:ascii="Arial" w:hAnsi="Arial" w:cs="Arial"/>
+                <w:color w:val="FFFFFF" w:themeColor="background1"/>
+                <w:sz w:val="32"/>
+                <w:szCs w:val="32"/>
+                <w14:glow w14:rad="0">
+                  <w14:srgbClr w14:val="0070C0"/>
+                </w14:glow>
+              </w:rPr>
+            </w:pPr>
+            <w:r>
+              <w:rPr>
+                <w:rFonts w:ascii="Arial" w:hAnsi="Arial" w:cs="Arial"/>
+                <w:color w:val="FFFFFF" w:themeColor="background1"/>
+                <w:sz w:val="32"/>
+                <w:szCs w:val="32"/>
+                <w14:glow w14:rad="0">
+                  <w14:srgbClr w14:val="0070C0"/>
+                </w14:glow>
               </w:rPr>
               <w:t>NI_210N_7.5P_B1_037</w:t>
             </w:r>
@@ -1542,6 +1828,7 @@
             <w:tcBorders>
               <w:right w:val="single" w:sz="24" w:space="0" w:color="auto"/>
             </w:tcBorders>
+            <w:shd w:val="clear" w:color="auto" w:fill="FFFF00"/>
             <w:vAlign w:val="center"/>
           </w:tcPr>
           <w:p>
@@ -1573,21 +1860,23 @@
               <w:bottom w:val="single" w:sz="24" w:space="0" w:color="auto"/>
               <w:right w:val="single" w:sz="24" w:space="0" w:color="auto"/>
             </w:tcBorders>
-            <w:vAlign w:val="center"/>
-          </w:tcPr>
-          <w:p>
-            <w:pPr>
-              <w:jc w:val="center"/>
-              <w:rPr>
-                <w:rFonts w:ascii="Arial" w:hAnsi="Arial" w:cs="Arial"/>
-                <w:sz w:val="32"/>
-                <w:szCs w:val="32"/>
-              </w:rPr>
-            </w:pPr>
-            <w:r>
-              <w:rPr>
-                <w:rFonts w:ascii="Arial" w:hAnsi="Arial" w:cs="Arial"/>
-                <w:color w:val="000000"/>
+            <w:shd w:val="clear" w:color="auto" w:fill="EE0000"/>
+            <w:vAlign w:val="center"/>
+          </w:tcPr>
+          <w:p>
+            <w:pPr>
+              <w:jc w:val="center"/>
+              <w:rPr>
+                <w:rFonts w:ascii="Arial" w:hAnsi="Arial" w:cs="Arial"/>
+                <w:color w:val="000000" w:themeColor="text1"/>
+                <w:sz w:val="32"/>
+                <w:szCs w:val="32"/>
+              </w:rPr>
+            </w:pPr>
+            <w:r>
+              <w:rPr>
+                <w:rFonts w:ascii="Arial" w:hAnsi="Arial" w:cs="Arial"/>
+                <w:color w:val="000000" w:themeColor="text1"/>
                 <w:sz w:val="32"/>
                 <w:szCs w:val="32"/>
               </w:rPr>
@@ -1620,23 +1909,31 @@
         <w:tc>
           <w:tcPr>
             <w:tcW w:w="3145" w:type="dxa"/>
-            <w:vAlign w:val="center"/>
-          </w:tcPr>
-          <w:p>
-            <w:pPr>
-              <w:jc w:val="center"/>
-              <w:rPr>
-                <w:rFonts w:ascii="Arial" w:hAnsi="Arial" w:cs="Arial"/>
-                <w:sz w:val="32"/>
-                <w:szCs w:val="32"/>
-              </w:rPr>
-            </w:pPr>
-            <w:r>
-              <w:rPr>
-                <w:rFonts w:ascii="Arial" w:hAnsi="Arial" w:cs="Arial"/>
-                <w:color w:val="000000"/>
-                <w:sz w:val="32"/>
-                <w:szCs w:val="32"/>
+            <w:shd w:val="clear" w:color="auto" w:fill="0070C0"/>
+            <w:vAlign w:val="center"/>
+          </w:tcPr>
+          <w:p>
+            <w:pPr>
+              <w:jc w:val="center"/>
+              <w:rPr>
+                <w:rFonts w:ascii="Arial" w:hAnsi="Arial" w:cs="Arial"/>
+                <w:color w:val="FFFFFF" w:themeColor="background1"/>
+                <w:sz w:val="32"/>
+                <w:szCs w:val="32"/>
+                <w14:glow w14:rad="0">
+                  <w14:srgbClr w14:val="0070C0"/>
+                </w14:glow>
+              </w:rPr>
+            </w:pPr>
+            <w:r>
+              <w:rPr>
+                <w:rFonts w:ascii="Arial" w:hAnsi="Arial" w:cs="Arial"/>
+                <w:color w:val="FFFFFF" w:themeColor="background1"/>
+                <w:sz w:val="32"/>
+                <w:szCs w:val="32"/>
+                <w14:glow w14:rad="0">
+                  <w14:srgbClr w14:val="0070C0"/>
+                </w14:glow>
               </w:rPr>
               <w:t>NI_210N_7.5P_B2_038</w:t>
             </w:r>
@@ -1648,6 +1945,7 @@
             <w:tcBorders>
               <w:right w:val="single" w:sz="24" w:space="0" w:color="auto"/>
             </w:tcBorders>
+            <w:shd w:val="clear" w:color="auto" w:fill="FFFF00"/>
             <w:vAlign w:val="center"/>
           </w:tcPr>
           <w:p>
@@ -1679,21 +1977,23 @@
               <w:bottom w:val="single" w:sz="24" w:space="0" w:color="auto"/>
               <w:right w:val="single" w:sz="24" w:space="0" w:color="auto"/>
             </w:tcBorders>
-            <w:vAlign w:val="center"/>
-          </w:tcPr>
-          <w:p>
-            <w:pPr>
-              <w:jc w:val="center"/>
-              <w:rPr>
-                <w:rFonts w:ascii="Arial" w:hAnsi="Arial" w:cs="Arial"/>
-                <w:sz w:val="32"/>
-                <w:szCs w:val="32"/>
-              </w:rPr>
-            </w:pPr>
-            <w:r>
-              <w:rPr>
-                <w:rFonts w:ascii="Arial" w:hAnsi="Arial" w:cs="Arial"/>
-                <w:color w:val="000000"/>
+            <w:shd w:val="clear" w:color="auto" w:fill="EE0000"/>
+            <w:vAlign w:val="center"/>
+          </w:tcPr>
+          <w:p>
+            <w:pPr>
+              <w:jc w:val="center"/>
+              <w:rPr>
+                <w:rFonts w:ascii="Arial" w:hAnsi="Arial" w:cs="Arial"/>
+                <w:color w:val="000000" w:themeColor="text1"/>
+                <w:sz w:val="32"/>
+                <w:szCs w:val="32"/>
+              </w:rPr>
+            </w:pPr>
+            <w:r>
+              <w:rPr>
+                <w:rFonts w:ascii="Arial" w:hAnsi="Arial" w:cs="Arial"/>
+                <w:color w:val="000000" w:themeColor="text1"/>
                 <w:sz w:val="32"/>
                 <w:szCs w:val="32"/>
               </w:rPr>
@@ -1726,23 +2026,31 @@
         <w:tc>
           <w:tcPr>
             <w:tcW w:w="3145" w:type="dxa"/>
-            <w:vAlign w:val="center"/>
-          </w:tcPr>
-          <w:p>
-            <w:pPr>
-              <w:jc w:val="center"/>
-              <w:rPr>
-                <w:rFonts w:ascii="Arial" w:hAnsi="Arial" w:cs="Arial"/>
-                <w:sz w:val="32"/>
-                <w:szCs w:val="32"/>
-              </w:rPr>
-            </w:pPr>
-            <w:r>
-              <w:rPr>
-                <w:rFonts w:ascii="Arial" w:hAnsi="Arial" w:cs="Arial"/>
-                <w:color w:val="000000"/>
-                <w:sz w:val="32"/>
-                <w:szCs w:val="32"/>
+            <w:shd w:val="clear" w:color="auto" w:fill="0070C0"/>
+            <w:vAlign w:val="center"/>
+          </w:tcPr>
+          <w:p>
+            <w:pPr>
+              <w:jc w:val="center"/>
+              <w:rPr>
+                <w:rFonts w:ascii="Arial" w:hAnsi="Arial" w:cs="Arial"/>
+                <w:color w:val="FFFFFF" w:themeColor="background1"/>
+                <w:sz w:val="32"/>
+                <w:szCs w:val="32"/>
+                <w14:glow w14:rad="0">
+                  <w14:srgbClr w14:val="0070C0"/>
+                </w14:glow>
+              </w:rPr>
+            </w:pPr>
+            <w:r>
+              <w:rPr>
+                <w:rFonts w:ascii="Arial" w:hAnsi="Arial" w:cs="Arial"/>
+                <w:color w:val="FFFFFF" w:themeColor="background1"/>
+                <w:sz w:val="32"/>
+                <w:szCs w:val="32"/>
+                <w14:glow w14:rad="0">
+                  <w14:srgbClr w14:val="0070C0"/>
+                </w14:glow>
               </w:rPr>
               <w:t>NI_210N_7.5P_B3_039</w:t>
             </w:r>
@@ -1754,6 +2062,7 @@
             <w:tcBorders>
               <w:right w:val="single" w:sz="24" w:space="0" w:color="auto"/>
             </w:tcBorders>
+            <w:shd w:val="clear" w:color="auto" w:fill="FFFF00"/>
             <w:vAlign w:val="center"/>
           </w:tcPr>
           <w:p>
@@ -1823,23 +2132,31 @@
         <w:tc>
           <w:tcPr>
             <w:tcW w:w="3145" w:type="dxa"/>
-            <w:vAlign w:val="center"/>
-          </w:tcPr>
-          <w:p>
-            <w:pPr>
-              <w:jc w:val="center"/>
-              <w:rPr>
-                <w:rFonts w:ascii="Arial" w:hAnsi="Arial" w:cs="Arial"/>
-                <w:sz w:val="32"/>
-                <w:szCs w:val="32"/>
-              </w:rPr>
-            </w:pPr>
-            <w:r>
-              <w:rPr>
-                <w:rFonts w:ascii="Arial" w:hAnsi="Arial" w:cs="Arial"/>
-                <w:color w:val="000000"/>
-                <w:sz w:val="32"/>
-                <w:szCs w:val="32"/>
+            <w:shd w:val="clear" w:color="auto" w:fill="0070C0"/>
+            <w:vAlign w:val="center"/>
+          </w:tcPr>
+          <w:p>
+            <w:pPr>
+              <w:jc w:val="center"/>
+              <w:rPr>
+                <w:rFonts w:ascii="Arial" w:hAnsi="Arial" w:cs="Arial"/>
+                <w:color w:val="FFFFFF" w:themeColor="background1"/>
+                <w:sz w:val="32"/>
+                <w:szCs w:val="32"/>
+                <w14:glow w14:rad="0">
+                  <w14:srgbClr w14:val="0070C0"/>
+                </w14:glow>
+              </w:rPr>
+            </w:pPr>
+            <w:r>
+              <w:rPr>
+                <w:rFonts w:ascii="Arial" w:hAnsi="Arial" w:cs="Arial"/>
+                <w:color w:val="FFFFFF" w:themeColor="background1"/>
+                <w:sz w:val="32"/>
+                <w:szCs w:val="32"/>
+                <w14:glow w14:rad="0">
+                  <w14:srgbClr w14:val="0070C0"/>
+                </w14:glow>
               </w:rPr>
               <w:t>NI_210N_7.5P_B4_040</w:t>
             </w:r>
@@ -1851,23 +2168,31 @@
             <w:tcBorders>
               <w:right w:val="single" w:sz="24" w:space="0" w:color="auto"/>
             </w:tcBorders>
-            <w:vAlign w:val="center"/>
-          </w:tcPr>
-          <w:p>
-            <w:pPr>
-              <w:jc w:val="center"/>
-              <w:rPr>
-                <w:rFonts w:ascii="Arial" w:hAnsi="Arial" w:cs="Arial"/>
-                <w:sz w:val="32"/>
-                <w:szCs w:val="32"/>
-              </w:rPr>
-            </w:pPr>
-            <w:r>
-              <w:rPr>
-                <w:rFonts w:ascii="Arial" w:hAnsi="Arial" w:cs="Arial"/>
-                <w:color w:val="000000"/>
-                <w:sz w:val="32"/>
-                <w:szCs w:val="32"/>
+            <w:shd w:val="clear" w:color="auto" w:fill="000000" w:themeFill="text1"/>
+            <w:vAlign w:val="center"/>
+          </w:tcPr>
+          <w:p>
+            <w:pPr>
+              <w:jc w:val="center"/>
+              <w:rPr>
+                <w:rFonts w:ascii="Arial" w:hAnsi="Arial" w:cs="Arial"/>
+                <w:color w:val="FFFFFF" w:themeColor="background1"/>
+                <w:sz w:val="32"/>
+                <w:szCs w:val="32"/>
+                <w14:glow w14:rad="0">
+                  <w14:srgbClr w14:val="00B0F0"/>
+                </w14:glow>
+              </w:rPr>
+            </w:pPr>
+            <w:r>
+              <w:rPr>
+                <w:rFonts w:ascii="Arial" w:hAnsi="Arial" w:cs="Arial"/>
+                <w:color w:val="FFFFFF" w:themeColor="background1"/>
+                <w:sz w:val="32"/>
+                <w:szCs w:val="32"/>
+                <w14:glow w14:rad="0">
+                  <w14:srgbClr w14:val="00B0F0"/>
+                </w14:glow>
               </w:rPr>
               <w:t>NI_210N_62P_B3_051</w:t>
             </w:r>
@@ -1920,6 +2245,7 @@
         <w:tc>
           <w:tcPr>
             <w:tcW w:w="3145" w:type="dxa"/>
+            <w:shd w:val="clear" w:color="auto" w:fill="00B050"/>
             <w:vAlign w:val="center"/>
           </w:tcPr>
           <w:p>
@@ -1948,23 +2274,31 @@
             <w:tcBorders>
               <w:right w:val="single" w:sz="24" w:space="0" w:color="auto"/>
             </w:tcBorders>
-            <w:vAlign w:val="center"/>
-          </w:tcPr>
-          <w:p>
-            <w:pPr>
-              <w:jc w:val="center"/>
-              <w:rPr>
-                <w:rFonts w:ascii="Arial" w:hAnsi="Arial" w:cs="Arial"/>
-                <w:sz w:val="32"/>
-                <w:szCs w:val="32"/>
-              </w:rPr>
-            </w:pPr>
-            <w:r>
-              <w:rPr>
-                <w:rFonts w:ascii="Arial" w:hAnsi="Arial" w:cs="Arial"/>
-                <w:color w:val="000000"/>
-                <w:sz w:val="32"/>
-                <w:szCs w:val="32"/>
+            <w:shd w:val="clear" w:color="auto" w:fill="000000" w:themeFill="text1"/>
+            <w:vAlign w:val="center"/>
+          </w:tcPr>
+          <w:p>
+            <w:pPr>
+              <w:jc w:val="center"/>
+              <w:rPr>
+                <w:rFonts w:ascii="Arial" w:hAnsi="Arial" w:cs="Arial"/>
+                <w:color w:val="FFFFFF" w:themeColor="background1"/>
+                <w:sz w:val="32"/>
+                <w:szCs w:val="32"/>
+                <w14:glow w14:rad="0">
+                  <w14:srgbClr w14:val="00B0F0"/>
+                </w14:glow>
+              </w:rPr>
+            </w:pPr>
+            <w:r>
+              <w:rPr>
+                <w:rFonts w:ascii="Arial" w:hAnsi="Arial" w:cs="Arial"/>
+                <w:color w:val="FFFFFF" w:themeColor="background1"/>
+                <w:sz w:val="32"/>
+                <w:szCs w:val="32"/>
+                <w14:glow w14:rad="0">
+                  <w14:srgbClr w14:val="00B0F0"/>
+                </w14:glow>
               </w:rPr>
               <w:t>NI_210N_62P_B4_052</w:t>
             </w:r>
@@ -2017,6 +2351,7 @@
         <w:tc>
           <w:tcPr>
             <w:tcW w:w="3145" w:type="dxa"/>
+            <w:shd w:val="clear" w:color="auto" w:fill="00B050"/>
             <w:vAlign w:val="center"/>
           </w:tcPr>
           <w:p>
@@ -2045,23 +2380,31 @@
             <w:tcBorders>
               <w:right w:val="single" w:sz="24" w:space="0" w:color="auto"/>
             </w:tcBorders>
-            <w:vAlign w:val="center"/>
-          </w:tcPr>
-          <w:p>
-            <w:pPr>
-              <w:jc w:val="center"/>
-              <w:rPr>
-                <w:rFonts w:ascii="Arial" w:hAnsi="Arial" w:cs="Arial"/>
-                <w:sz w:val="32"/>
-                <w:szCs w:val="32"/>
-              </w:rPr>
-            </w:pPr>
-            <w:r>
-              <w:rPr>
-                <w:rFonts w:ascii="Arial" w:hAnsi="Arial" w:cs="Arial"/>
-                <w:color w:val="000000"/>
-                <w:sz w:val="32"/>
-                <w:szCs w:val="32"/>
+            <w:shd w:val="clear" w:color="auto" w:fill="000000" w:themeFill="text1"/>
+            <w:vAlign w:val="center"/>
+          </w:tcPr>
+          <w:p>
+            <w:pPr>
+              <w:jc w:val="center"/>
+              <w:rPr>
+                <w:rFonts w:ascii="Arial" w:hAnsi="Arial" w:cs="Arial"/>
+                <w:color w:val="FFFFFF" w:themeColor="background1"/>
+                <w:sz w:val="32"/>
+                <w:szCs w:val="32"/>
+                <w14:glow w14:rad="0">
+                  <w14:srgbClr w14:val="00B0F0"/>
+                </w14:glow>
+              </w:rPr>
+            </w:pPr>
+            <w:r>
+              <w:rPr>
+                <w:rFonts w:ascii="Arial" w:hAnsi="Arial" w:cs="Arial"/>
+                <w:color w:val="FFFFFF" w:themeColor="background1"/>
+                <w:sz w:val="32"/>
+                <w:szCs w:val="32"/>
+                <w14:glow w14:rad="0">
+                  <w14:srgbClr w14:val="00B0F0"/>
+                </w14:glow>
               </w:rPr>
               <w:t>NI_210N_62P_B1_053</w:t>
             </w:r>
@@ -2114,6 +2457,7 @@
         <w:tc>
           <w:tcPr>
             <w:tcW w:w="3145" w:type="dxa"/>
+            <w:shd w:val="clear" w:color="auto" w:fill="00B050"/>
             <w:vAlign w:val="center"/>
           </w:tcPr>
           <w:p>
@@ -2142,23 +2486,31 @@
             <w:tcBorders>
               <w:right w:val="single" w:sz="24" w:space="0" w:color="auto"/>
             </w:tcBorders>
-            <w:vAlign w:val="center"/>
-          </w:tcPr>
-          <w:p>
-            <w:pPr>
-              <w:jc w:val="center"/>
-              <w:rPr>
-                <w:rFonts w:ascii="Arial" w:hAnsi="Arial" w:cs="Arial"/>
-                <w:sz w:val="32"/>
-                <w:szCs w:val="32"/>
-              </w:rPr>
-            </w:pPr>
-            <w:r>
-              <w:rPr>
-                <w:rFonts w:ascii="Arial" w:hAnsi="Arial" w:cs="Arial"/>
-                <w:color w:val="000000"/>
-                <w:sz w:val="32"/>
-                <w:szCs w:val="32"/>
+            <w:shd w:val="clear" w:color="auto" w:fill="000000" w:themeFill="text1"/>
+            <w:vAlign w:val="center"/>
+          </w:tcPr>
+          <w:p>
+            <w:pPr>
+              <w:jc w:val="center"/>
+              <w:rPr>
+                <w:rFonts w:ascii="Arial" w:hAnsi="Arial" w:cs="Arial"/>
+                <w:color w:val="FFFFFF" w:themeColor="background1"/>
+                <w:sz w:val="32"/>
+                <w:szCs w:val="32"/>
+                <w14:glow w14:rad="0">
+                  <w14:srgbClr w14:val="00B0F0"/>
+                </w14:glow>
+              </w:rPr>
+            </w:pPr>
+            <w:r>
+              <w:rPr>
+                <w:rFonts w:ascii="Arial" w:hAnsi="Arial" w:cs="Arial"/>
+                <w:color w:val="FFFFFF" w:themeColor="background1"/>
+                <w:sz w:val="32"/>
+                <w:szCs w:val="32"/>
+                <w14:glow w14:rad="0">
+                  <w14:srgbClr w14:val="00B0F0"/>
+                </w14:glow>
               </w:rPr>
               <w:t>NI_210N_62P_B2_054</w:t>
             </w:r>
@@ -2211,6 +2563,7 @@
         <w:tc>
           <w:tcPr>
             <w:tcW w:w="3145" w:type="dxa"/>
+            <w:shd w:val="clear" w:color="auto" w:fill="00B050"/>
             <w:vAlign w:val="center"/>
           </w:tcPr>
           <w:p>
@@ -2239,23 +2592,31 @@
             <w:tcBorders>
               <w:right w:val="single" w:sz="24" w:space="0" w:color="auto"/>
             </w:tcBorders>
-            <w:vAlign w:val="center"/>
-          </w:tcPr>
-          <w:p>
-            <w:pPr>
-              <w:jc w:val="center"/>
-              <w:rPr>
-                <w:rFonts w:ascii="Arial" w:hAnsi="Arial" w:cs="Arial"/>
-                <w:sz w:val="32"/>
-                <w:szCs w:val="32"/>
-              </w:rPr>
-            </w:pPr>
-            <w:r>
-              <w:rPr>
-                <w:rFonts w:ascii="Arial" w:hAnsi="Arial" w:cs="Arial"/>
-                <w:color w:val="000000"/>
-                <w:sz w:val="32"/>
-                <w:szCs w:val="32"/>
+            <w:shd w:val="clear" w:color="auto" w:fill="000000" w:themeFill="text1"/>
+            <w:vAlign w:val="center"/>
+          </w:tcPr>
+          <w:p>
+            <w:pPr>
+              <w:jc w:val="center"/>
+              <w:rPr>
+                <w:rFonts w:ascii="Arial" w:hAnsi="Arial" w:cs="Arial"/>
+                <w:color w:val="FFFFFF" w:themeColor="background1"/>
+                <w:sz w:val="32"/>
+                <w:szCs w:val="32"/>
+                <w14:glow w14:rad="0">
+                  <w14:srgbClr w14:val="00B0F0"/>
+                </w14:glow>
+              </w:rPr>
+            </w:pPr>
+            <w:r>
+              <w:rPr>
+                <w:rFonts w:ascii="Arial" w:hAnsi="Arial" w:cs="Arial"/>
+                <w:color w:val="FFFFFF" w:themeColor="background1"/>
+                <w:sz w:val="32"/>
+                <w:szCs w:val="32"/>
+                <w14:glow w14:rad="0">
+                  <w14:srgbClr w14:val="00B0F0"/>
+                </w14:glow>
               </w:rPr>
               <w:t>NI_210N_62P_B3_055</w:t>
             </w:r>
@@ -2322,9 +2683,12 @@
             <w:r>
               <w:rPr>
                 <w:rFonts w:ascii="Arial" w:hAnsi="Arial" w:cs="Arial"/>
-                <w:color w:val="000000"/>
-                <w:sz w:val="32"/>
-                <w:szCs w:val="32"/>
+                <w:color w:val="FFFFFF" w:themeColor="background1"/>
+                <w:sz w:val="32"/>
+                <w:szCs w:val="32"/>
+                <w14:glow w14:rad="635000">
+                  <w14:srgbClr w14:val="7030A0"/>
+                </w14:glow>
               </w:rPr>
               <w:lastRenderedPageBreak/>
               <w:t>YI_0N_0P_B2_061</w:t>
@@ -2344,16 +2708,23 @@
               <w:jc w:val="center"/>
               <w:rPr>
                 <w:rFonts w:ascii="Arial" w:hAnsi="Arial" w:cs="Arial"/>
-                <w:sz w:val="32"/>
-                <w:szCs w:val="32"/>
-              </w:rPr>
-            </w:pPr>
-            <w:r>
-              <w:rPr>
-                <w:rFonts w:ascii="Arial" w:hAnsi="Arial" w:cs="Arial"/>
-                <w:color w:val="000000"/>
-                <w:sz w:val="32"/>
-                <w:szCs w:val="32"/>
+                <w:color w:val="000000"/>
+                <w:sz w:val="32"/>
+                <w:szCs w:val="32"/>
+                <w14:glow w14:rad="635000">
+                  <w14:srgbClr w14:val="00B050"/>
+                </w14:glow>
+              </w:rPr>
+            </w:pPr>
+            <w:r>
+              <w:rPr>
+                <w:rFonts w:ascii="Arial" w:hAnsi="Arial" w:cs="Arial"/>
+                <w:color w:val="000000"/>
+                <w:sz w:val="32"/>
+                <w:szCs w:val="32"/>
+                <w14:glow w14:rad="635000">
+                  <w14:srgbClr w14:val="00B050"/>
+                </w14:glow>
               </w:rPr>
               <w:t>YI_0N_15P_B1_072</w:t>
             </w:r>
@@ -2375,16 +2746,23 @@
               <w:jc w:val="center"/>
               <w:rPr>
                 <w:rFonts w:ascii="Arial" w:hAnsi="Arial" w:cs="Arial"/>
-                <w:sz w:val="32"/>
-                <w:szCs w:val="32"/>
-              </w:rPr>
-            </w:pPr>
-            <w:r>
-              <w:rPr>
-                <w:rFonts w:ascii="Arial" w:hAnsi="Arial" w:cs="Arial"/>
-                <w:color w:val="000000"/>
-                <w:sz w:val="32"/>
-                <w:szCs w:val="32"/>
+                <w:color w:val="FFFFFF" w:themeColor="background1"/>
+                <w:sz w:val="32"/>
+                <w:szCs w:val="32"/>
+                <w14:glow w14:rad="635000">
+                  <w14:schemeClr w14:val="tx1"/>
+                </w14:glow>
+              </w:rPr>
+            </w:pPr>
+            <w:r>
+              <w:rPr>
+                <w:rFonts w:ascii="Arial" w:hAnsi="Arial" w:cs="Arial"/>
+                <w:color w:val="FFFFFF" w:themeColor="background1"/>
+                <w:sz w:val="32"/>
+                <w:szCs w:val="32"/>
+                <w14:glow w14:rad="635000">
+                  <w14:schemeClr w14:val="tx1"/>
+                </w14:glow>
               </w:rPr>
               <w:t>YI_0N_62P_B4_083</w:t>
             </w:r>
@@ -2422,16 +2800,23 @@
               <w:jc w:val="center"/>
               <w:rPr>
                 <w:rFonts w:ascii="Arial" w:hAnsi="Arial" w:cs="Arial"/>
-                <w:sz w:val="32"/>
-                <w:szCs w:val="32"/>
-              </w:rPr>
-            </w:pPr>
-            <w:r>
-              <w:rPr>
-                <w:rFonts w:ascii="Arial" w:hAnsi="Arial" w:cs="Arial"/>
-                <w:color w:val="000000"/>
-                <w:sz w:val="32"/>
-                <w:szCs w:val="32"/>
+                <w:color w:val="FFFFFF" w:themeColor="background1"/>
+                <w:sz w:val="32"/>
+                <w:szCs w:val="32"/>
+                <w14:glow w14:rad="635000">
+                  <w14:srgbClr w14:val="7030A0"/>
+                </w14:glow>
+              </w:rPr>
+            </w:pPr>
+            <w:r>
+              <w:rPr>
+                <w:rFonts w:ascii="Arial" w:hAnsi="Arial" w:cs="Arial"/>
+                <w:color w:val="FFFFFF" w:themeColor="background1"/>
+                <w:sz w:val="32"/>
+                <w:szCs w:val="32"/>
+                <w14:glow w14:rad="635000">
+                  <w14:srgbClr w14:val="7030A0"/>
+                </w14:glow>
               </w:rPr>
               <w:t>YI_0N_0P_B3_062</w:t>
             </w:r>
@@ -2450,16 +2835,23 @@
               <w:jc w:val="center"/>
               <w:rPr>
                 <w:rFonts w:ascii="Arial" w:hAnsi="Arial" w:cs="Arial"/>
-                <w:sz w:val="32"/>
-                <w:szCs w:val="32"/>
-              </w:rPr>
-            </w:pPr>
-            <w:r>
-              <w:rPr>
-                <w:rFonts w:ascii="Arial" w:hAnsi="Arial" w:cs="Arial"/>
-                <w:color w:val="000000"/>
-                <w:sz w:val="32"/>
-                <w:szCs w:val="32"/>
+                <w:color w:val="000000"/>
+                <w:sz w:val="32"/>
+                <w:szCs w:val="32"/>
+                <w14:glow w14:rad="635000">
+                  <w14:srgbClr w14:val="00B050"/>
+                </w14:glow>
+              </w:rPr>
+            </w:pPr>
+            <w:r>
+              <w:rPr>
+                <w:rFonts w:ascii="Arial" w:hAnsi="Arial" w:cs="Arial"/>
+                <w:color w:val="000000"/>
+                <w:sz w:val="32"/>
+                <w:szCs w:val="32"/>
+                <w14:glow w14:rad="635000">
+                  <w14:srgbClr w14:val="00B050"/>
+                </w14:glow>
               </w:rPr>
               <w:t>YI_0N_15P_B2_073</w:t>
             </w:r>
@@ -2481,16 +2873,23 @@
               <w:jc w:val="center"/>
               <w:rPr>
                 <w:rFonts w:ascii="Arial" w:hAnsi="Arial" w:cs="Arial"/>
-                <w:sz w:val="32"/>
-                <w:szCs w:val="32"/>
-              </w:rPr>
-            </w:pPr>
-            <w:r>
-              <w:rPr>
-                <w:rFonts w:ascii="Arial" w:hAnsi="Arial" w:cs="Arial"/>
-                <w:color w:val="000000"/>
-                <w:sz w:val="32"/>
-                <w:szCs w:val="32"/>
+                <w:color w:val="FFFFFF" w:themeColor="background1"/>
+                <w:sz w:val="32"/>
+                <w:szCs w:val="32"/>
+                <w14:glow w14:rad="635000">
+                  <w14:schemeClr w14:val="tx1"/>
+                </w14:glow>
+              </w:rPr>
+            </w:pPr>
+            <w:r>
+              <w:rPr>
+                <w:rFonts w:ascii="Arial" w:hAnsi="Arial" w:cs="Arial"/>
+                <w:color w:val="FFFFFF" w:themeColor="background1"/>
+                <w:sz w:val="32"/>
+                <w:szCs w:val="32"/>
+                <w14:glow w14:rad="635000">
+                  <w14:schemeClr w14:val="tx1"/>
+                </w14:glow>
               </w:rPr>
               <w:t>YI_0N_62P_B1_084</w:t>
             </w:r>
@@ -2528,16 +2927,23 @@
               <w:jc w:val="center"/>
               <w:rPr>
                 <w:rFonts w:ascii="Arial" w:hAnsi="Arial" w:cs="Arial"/>
-                <w:sz w:val="32"/>
-                <w:szCs w:val="32"/>
-              </w:rPr>
-            </w:pPr>
-            <w:r>
-              <w:rPr>
-                <w:rFonts w:ascii="Arial" w:hAnsi="Arial" w:cs="Arial"/>
-                <w:color w:val="000000"/>
-                <w:sz w:val="32"/>
-                <w:szCs w:val="32"/>
+                <w:color w:val="FFFFFF" w:themeColor="background1"/>
+                <w:sz w:val="32"/>
+                <w:szCs w:val="32"/>
+                <w14:glow w14:rad="635000">
+                  <w14:srgbClr w14:val="7030A0"/>
+                </w14:glow>
+              </w:rPr>
+            </w:pPr>
+            <w:r>
+              <w:rPr>
+                <w:rFonts w:ascii="Arial" w:hAnsi="Arial" w:cs="Arial"/>
+                <w:color w:val="FFFFFF" w:themeColor="background1"/>
+                <w:sz w:val="32"/>
+                <w:szCs w:val="32"/>
+                <w14:glow w14:rad="635000">
+                  <w14:srgbClr w14:val="7030A0"/>
+                </w14:glow>
               </w:rPr>
               <w:t>YI_0N_0P_B4_063</w:t>
             </w:r>
@@ -2556,16 +2962,23 @@
               <w:jc w:val="center"/>
               <w:rPr>
                 <w:rFonts w:ascii="Arial" w:hAnsi="Arial" w:cs="Arial"/>
-                <w:sz w:val="32"/>
-                <w:szCs w:val="32"/>
-              </w:rPr>
-            </w:pPr>
-            <w:r>
-              <w:rPr>
-                <w:rFonts w:ascii="Arial" w:hAnsi="Arial" w:cs="Arial"/>
-                <w:color w:val="000000"/>
-                <w:sz w:val="32"/>
-                <w:szCs w:val="32"/>
+                <w:color w:val="000000"/>
+                <w:sz w:val="32"/>
+                <w:szCs w:val="32"/>
+                <w14:glow w14:rad="635000">
+                  <w14:srgbClr w14:val="00B050"/>
+                </w14:glow>
+              </w:rPr>
+            </w:pPr>
+            <w:r>
+              <w:rPr>
+                <w:rFonts w:ascii="Arial" w:hAnsi="Arial" w:cs="Arial"/>
+                <w:color w:val="000000"/>
+                <w:sz w:val="32"/>
+                <w:szCs w:val="32"/>
+                <w14:glow w14:rad="635000">
+                  <w14:srgbClr w14:val="00B050"/>
+                </w14:glow>
               </w:rPr>
               <w:t>YI_0N_15P_B3_074</w:t>
             </w:r>
@@ -2587,16 +3000,23 @@
               <w:jc w:val="center"/>
               <w:rPr>
                 <w:rFonts w:ascii="Arial" w:hAnsi="Arial" w:cs="Arial"/>
-                <w:sz w:val="32"/>
-                <w:szCs w:val="32"/>
-              </w:rPr>
-            </w:pPr>
-            <w:r>
-              <w:rPr>
-                <w:rFonts w:ascii="Arial" w:hAnsi="Arial" w:cs="Arial"/>
-                <w:color w:val="000000"/>
-                <w:sz w:val="32"/>
-                <w:szCs w:val="32"/>
+                <w:color w:val="FFFFFF" w:themeColor="background1"/>
+                <w:sz w:val="32"/>
+                <w:szCs w:val="32"/>
+                <w14:glow w14:rad="635000">
+                  <w14:schemeClr w14:val="tx1"/>
+                </w14:glow>
+              </w:rPr>
+            </w:pPr>
+            <w:r>
+              <w:rPr>
+                <w:rFonts w:ascii="Arial" w:hAnsi="Arial" w:cs="Arial"/>
+                <w:color w:val="FFFFFF" w:themeColor="background1"/>
+                <w:sz w:val="32"/>
+                <w:szCs w:val="32"/>
+                <w14:glow w14:rad="635000">
+                  <w14:schemeClr w14:val="tx1"/>
+                </w14:glow>
               </w:rPr>
               <w:t>YI_0N_62P_B2_085</w:t>
             </w:r>
@@ -2634,16 +3054,23 @@
               <w:jc w:val="center"/>
               <w:rPr>
                 <w:rFonts w:ascii="Arial" w:hAnsi="Arial" w:cs="Arial"/>
-                <w:sz w:val="32"/>
-                <w:szCs w:val="32"/>
-              </w:rPr>
-            </w:pPr>
-            <w:r>
-              <w:rPr>
-                <w:rFonts w:ascii="Arial" w:hAnsi="Arial" w:cs="Arial"/>
-                <w:color w:val="000000"/>
-                <w:sz w:val="32"/>
-                <w:szCs w:val="32"/>
+                <w:color w:val="FFFFFF" w:themeColor="background1"/>
+                <w:sz w:val="32"/>
+                <w:szCs w:val="32"/>
+                <w14:glow w14:rad="635000">
+                  <w14:srgbClr w14:val="7030A0"/>
+                </w14:glow>
+              </w:rPr>
+            </w:pPr>
+            <w:r>
+              <w:rPr>
+                <w:rFonts w:ascii="Arial" w:hAnsi="Arial" w:cs="Arial"/>
+                <w:color w:val="FFFFFF" w:themeColor="background1"/>
+                <w:sz w:val="32"/>
+                <w:szCs w:val="32"/>
+                <w14:glow w14:rad="635000">
+                  <w14:srgbClr w14:val="7030A0"/>
+                </w14:glow>
               </w:rPr>
               <w:t>YI_0N_0P_B1_064</w:t>
             </w:r>
@@ -2662,16 +3089,23 @@
               <w:jc w:val="center"/>
               <w:rPr>
                 <w:rFonts w:ascii="Arial" w:hAnsi="Arial" w:cs="Arial"/>
-                <w:sz w:val="32"/>
-                <w:szCs w:val="32"/>
-              </w:rPr>
-            </w:pPr>
-            <w:r>
-              <w:rPr>
-                <w:rFonts w:ascii="Arial" w:hAnsi="Arial" w:cs="Arial"/>
-                <w:color w:val="000000"/>
-                <w:sz w:val="32"/>
-                <w:szCs w:val="32"/>
+                <w:color w:val="000000"/>
+                <w:sz w:val="32"/>
+                <w:szCs w:val="32"/>
+                <w14:glow w14:rad="635000">
+                  <w14:srgbClr w14:val="00B050"/>
+                </w14:glow>
+              </w:rPr>
+            </w:pPr>
+            <w:r>
+              <w:rPr>
+                <w:rFonts w:ascii="Arial" w:hAnsi="Arial" w:cs="Arial"/>
+                <w:color w:val="000000"/>
+                <w:sz w:val="32"/>
+                <w:szCs w:val="32"/>
+                <w14:glow w14:rad="635000">
+                  <w14:srgbClr w14:val="00B050"/>
+                </w14:glow>
               </w:rPr>
               <w:t>YI_0N_15P_B4_075</w:t>
             </w:r>
@@ -2703,6 +3137,9 @@
                 <w:color w:val="000000"/>
                 <w:sz w:val="32"/>
                 <w:szCs w:val="32"/>
+                <w14:glow w14:rad="635000">
+                  <w14:srgbClr w14:val="EE0000"/>
+                </w14:glow>
               </w:rPr>
               <w:t>YI_0N_93P_B3_086</w:t>
             </w:r>
@@ -2740,16 +3177,23 @@
               <w:jc w:val="center"/>
               <w:rPr>
                 <w:rFonts w:ascii="Arial" w:hAnsi="Arial" w:cs="Arial"/>
-                <w:sz w:val="32"/>
-                <w:szCs w:val="32"/>
-              </w:rPr>
-            </w:pPr>
-            <w:r>
-              <w:rPr>
-                <w:rFonts w:ascii="Arial" w:hAnsi="Arial" w:cs="Arial"/>
-                <w:color w:val="000000"/>
-                <w:sz w:val="32"/>
-                <w:szCs w:val="32"/>
+                <w:color w:val="FFFFFF" w:themeColor="background1"/>
+                <w:sz w:val="32"/>
+                <w:szCs w:val="32"/>
+                <w14:glow w14:rad="635000">
+                  <w14:srgbClr w14:val="7030A0"/>
+                </w14:glow>
+              </w:rPr>
+            </w:pPr>
+            <w:r>
+              <w:rPr>
+                <w:rFonts w:ascii="Arial" w:hAnsi="Arial" w:cs="Arial"/>
+                <w:color w:val="FFFFFF" w:themeColor="background1"/>
+                <w:sz w:val="32"/>
+                <w:szCs w:val="32"/>
+                <w14:glow w14:rad="635000">
+                  <w14:srgbClr w14:val="7030A0"/>
+                </w14:glow>
               </w:rPr>
               <w:t>YI_0N_0P_B2_065</w:t>
             </w:r>
@@ -2768,16 +3212,23 @@
               <w:jc w:val="center"/>
               <w:rPr>
                 <w:rFonts w:ascii="Arial" w:hAnsi="Arial" w:cs="Arial"/>
-                <w:sz w:val="32"/>
-                <w:szCs w:val="32"/>
-              </w:rPr>
-            </w:pPr>
-            <w:r>
-              <w:rPr>
-                <w:rFonts w:ascii="Arial" w:hAnsi="Arial" w:cs="Arial"/>
-                <w:color w:val="000000"/>
-                <w:sz w:val="32"/>
-                <w:szCs w:val="32"/>
+                <w:color w:val="000000"/>
+                <w:sz w:val="32"/>
+                <w:szCs w:val="32"/>
+                <w14:glow w14:rad="635000">
+                  <w14:srgbClr w14:val="92D050"/>
+                </w14:glow>
+              </w:rPr>
+            </w:pPr>
+            <w:r>
+              <w:rPr>
+                <w:rFonts w:ascii="Arial" w:hAnsi="Arial" w:cs="Arial"/>
+                <w:color w:val="000000"/>
+                <w:sz w:val="32"/>
+                <w:szCs w:val="32"/>
+                <w14:glow w14:rad="635000">
+                  <w14:srgbClr w14:val="FFFF00"/>
+                </w14:glow>
               </w:rPr>
               <w:t>YI_0N_31P_B1_076</w:t>
             </w:r>
@@ -2799,16 +3250,23 @@
               <w:jc w:val="center"/>
               <w:rPr>
                 <w:rFonts w:ascii="Arial" w:hAnsi="Arial" w:cs="Arial"/>
-                <w:sz w:val="32"/>
-                <w:szCs w:val="32"/>
-              </w:rPr>
-            </w:pPr>
-            <w:r>
-              <w:rPr>
-                <w:rFonts w:ascii="Arial" w:hAnsi="Arial" w:cs="Arial"/>
-                <w:color w:val="000000"/>
-                <w:sz w:val="32"/>
-                <w:szCs w:val="32"/>
+                <w:color w:val="000000"/>
+                <w:sz w:val="32"/>
+                <w:szCs w:val="32"/>
+                <w14:glow w14:rad="635000">
+                  <w14:srgbClr w14:val="EE0000"/>
+                </w14:glow>
+              </w:rPr>
+            </w:pPr>
+            <w:r>
+              <w:rPr>
+                <w:rFonts w:ascii="Arial" w:hAnsi="Arial" w:cs="Arial"/>
+                <w:color w:val="000000"/>
+                <w:sz w:val="32"/>
+                <w:szCs w:val="32"/>
+                <w14:glow w14:rad="635000">
+                  <w14:srgbClr w14:val="EE0000"/>
+                </w14:glow>
               </w:rPr>
               <w:t>YI_0N_93P_B4_087</w:t>
             </w:r>
@@ -2846,16 +3304,33 @@
               <w:jc w:val="center"/>
               <w:rPr>
                 <w:rFonts w:ascii="Arial" w:hAnsi="Arial" w:cs="Arial"/>
-                <w:sz w:val="32"/>
-                <w:szCs w:val="32"/>
-              </w:rPr>
-            </w:pPr>
-            <w:r>
-              <w:rPr>
-                <w:rFonts w:ascii="Arial" w:hAnsi="Arial" w:cs="Arial"/>
-                <w:color w:val="000000"/>
-                <w:sz w:val="32"/>
-                <w:szCs w:val="32"/>
+                <w:color w:val="FFFFFF" w:themeColor="background1"/>
+                <w:sz w:val="32"/>
+                <w:szCs w:val="32"/>
+                <w14:glow w14:rad="629488">
+                  <w14:srgbClr w14:val="FFFF00"/>
+                </w14:glow>
+                <w14:textOutline w14:w="9525" w14:cap="rnd" w14:cmpd="sng" w14:algn="ctr">
+                  <w14:noFill/>
+                  <w14:prstDash w14:val="solid"/>
+                  <w14:bevel/>
+                </w14:textOutline>
+              </w:rPr>
+            </w:pPr>
+            <w:r>
+              <w:rPr>
+                <w:rFonts w:ascii="Arial" w:hAnsi="Arial" w:cs="Arial"/>
+                <w:color w:val="FFFFFF" w:themeColor="background1"/>
+                <w:sz w:val="32"/>
+                <w:szCs w:val="32"/>
+                <w14:glow w14:rad="635000">
+                  <w14:srgbClr w14:val="0070C0"/>
+                </w14:glow>
+                <w14:textOutline w14:w="9525" w14:cap="rnd" w14:cmpd="sng" w14:algn="ctr">
+                  <w14:noFill/>
+                  <w14:prstDash w14:val="solid"/>
+                  <w14:bevel/>
+                </w14:textOutline>
               </w:rPr>
               <w:t>YI_0N_7.5P_B3_066</w:t>
             </w:r>
@@ -2874,16 +3349,23 @@
               <w:jc w:val="center"/>
               <w:rPr>
                 <w:rFonts w:ascii="Arial" w:hAnsi="Arial" w:cs="Arial"/>
-                <w:sz w:val="32"/>
-                <w:szCs w:val="32"/>
-              </w:rPr>
-            </w:pPr>
-            <w:r>
-              <w:rPr>
-                <w:rFonts w:ascii="Arial" w:hAnsi="Arial" w:cs="Arial"/>
-                <w:color w:val="000000"/>
-                <w:sz w:val="32"/>
-                <w:szCs w:val="32"/>
+                <w:color w:val="000000"/>
+                <w:sz w:val="32"/>
+                <w:szCs w:val="32"/>
+                <w14:glow w14:rad="635000">
+                  <w14:srgbClr w14:val="FFFF00"/>
+                </w14:glow>
+              </w:rPr>
+            </w:pPr>
+            <w:r>
+              <w:rPr>
+                <w:rFonts w:ascii="Arial" w:hAnsi="Arial" w:cs="Arial"/>
+                <w:color w:val="000000"/>
+                <w:sz w:val="32"/>
+                <w:szCs w:val="32"/>
+                <w14:glow w14:rad="635000">
+                  <w14:srgbClr w14:val="FFFF00"/>
+                </w14:glow>
               </w:rPr>
               <w:t>YI_0N_31P_B2_077</w:t>
             </w:r>
@@ -2905,16 +3387,23 @@
               <w:jc w:val="center"/>
               <w:rPr>
                 <w:rFonts w:ascii="Arial" w:hAnsi="Arial" w:cs="Arial"/>
-                <w:sz w:val="32"/>
-                <w:szCs w:val="32"/>
-              </w:rPr>
-            </w:pPr>
-            <w:r>
-              <w:rPr>
-                <w:rFonts w:ascii="Arial" w:hAnsi="Arial" w:cs="Arial"/>
-                <w:color w:val="000000"/>
-                <w:sz w:val="32"/>
-                <w:szCs w:val="32"/>
+                <w:color w:val="000000"/>
+                <w:sz w:val="32"/>
+                <w:szCs w:val="32"/>
+                <w14:glow w14:rad="635000">
+                  <w14:srgbClr w14:val="EE0000"/>
+                </w14:glow>
+              </w:rPr>
+            </w:pPr>
+            <w:r>
+              <w:rPr>
+                <w:rFonts w:ascii="Arial" w:hAnsi="Arial" w:cs="Arial"/>
+                <w:color w:val="000000"/>
+                <w:sz w:val="32"/>
+                <w:szCs w:val="32"/>
+                <w14:glow w14:rad="635000">
+                  <w14:srgbClr w14:val="EE0000"/>
+                </w14:glow>
               </w:rPr>
               <w:t>YI_0N_93P_B1_088</w:t>
             </w:r>
@@ -2952,16 +3441,33 @@
               <w:jc w:val="center"/>
               <w:rPr>
                 <w:rFonts w:ascii="Arial" w:hAnsi="Arial" w:cs="Arial"/>
-                <w:sz w:val="32"/>
-                <w:szCs w:val="32"/>
-              </w:rPr>
-            </w:pPr>
-            <w:r>
-              <w:rPr>
-                <w:rFonts w:ascii="Arial" w:hAnsi="Arial" w:cs="Arial"/>
-                <w:color w:val="000000"/>
-                <w:sz w:val="32"/>
-                <w:szCs w:val="32"/>
+                <w:color w:val="FFFFFF" w:themeColor="background1"/>
+                <w:sz w:val="32"/>
+                <w:szCs w:val="32"/>
+                <w14:glow w14:rad="635000">
+                  <w14:srgbClr w14:val="0070C0"/>
+                </w14:glow>
+                <w14:textOutline w14:w="9525" w14:cap="rnd" w14:cmpd="sng" w14:algn="ctr">
+                  <w14:noFill/>
+                  <w14:prstDash w14:val="solid"/>
+                  <w14:bevel/>
+                </w14:textOutline>
+              </w:rPr>
+            </w:pPr>
+            <w:r>
+              <w:rPr>
+                <w:rFonts w:ascii="Arial" w:hAnsi="Arial" w:cs="Arial"/>
+                <w:color w:val="FFFFFF" w:themeColor="background1"/>
+                <w:sz w:val="32"/>
+                <w:szCs w:val="32"/>
+                <w14:glow w14:rad="635000">
+                  <w14:srgbClr w14:val="0070C0"/>
+                </w14:glow>
+                <w14:textOutline w14:w="9525" w14:cap="rnd" w14:cmpd="sng" w14:algn="ctr">
+                  <w14:noFill/>
+                  <w14:prstDash w14:val="solid"/>
+                  <w14:bevel/>
+                </w14:textOutline>
               </w:rPr>
               <w:t>YI_0N_7.5P_B4_067</w:t>
             </w:r>
@@ -2980,16 +3486,23 @@
               <w:jc w:val="center"/>
               <w:rPr>
                 <w:rFonts w:ascii="Arial" w:hAnsi="Arial" w:cs="Arial"/>
-                <w:sz w:val="32"/>
-                <w:szCs w:val="32"/>
-              </w:rPr>
-            </w:pPr>
-            <w:r>
-              <w:rPr>
-                <w:rFonts w:ascii="Arial" w:hAnsi="Arial" w:cs="Arial"/>
-                <w:color w:val="000000"/>
-                <w:sz w:val="32"/>
-                <w:szCs w:val="32"/>
+                <w:color w:val="000000"/>
+                <w:sz w:val="32"/>
+                <w:szCs w:val="32"/>
+                <w14:glow w14:rad="635000">
+                  <w14:srgbClr w14:val="FFFF00"/>
+                </w14:glow>
+              </w:rPr>
+            </w:pPr>
+            <w:r>
+              <w:rPr>
+                <w:rFonts w:ascii="Arial" w:hAnsi="Arial" w:cs="Arial"/>
+                <w:color w:val="000000"/>
+                <w:sz w:val="32"/>
+                <w:szCs w:val="32"/>
+                <w14:glow w14:rad="635000">
+                  <w14:srgbClr w14:val="FFFF00"/>
+                </w14:glow>
               </w:rPr>
               <w:t>YI_0N_31P_B3_078</w:t>
             </w:r>
@@ -3011,16 +3524,23 @@
               <w:jc w:val="center"/>
               <w:rPr>
                 <w:rFonts w:ascii="Arial" w:hAnsi="Arial" w:cs="Arial"/>
-                <w:sz w:val="32"/>
-                <w:szCs w:val="32"/>
-              </w:rPr>
-            </w:pPr>
-            <w:r>
-              <w:rPr>
-                <w:rFonts w:ascii="Arial" w:hAnsi="Arial" w:cs="Arial"/>
-                <w:color w:val="000000"/>
-                <w:sz w:val="32"/>
-                <w:szCs w:val="32"/>
+                <w:color w:val="000000"/>
+                <w:sz w:val="32"/>
+                <w:szCs w:val="32"/>
+                <w14:glow w14:rad="635000">
+                  <w14:srgbClr w14:val="EE0000"/>
+                </w14:glow>
+              </w:rPr>
+            </w:pPr>
+            <w:r>
+              <w:rPr>
+                <w:rFonts w:ascii="Arial" w:hAnsi="Arial" w:cs="Arial"/>
+                <w:color w:val="000000"/>
+                <w:sz w:val="32"/>
+                <w:szCs w:val="32"/>
+                <w14:glow w14:rad="635000">
+                  <w14:srgbClr w14:val="EE0000"/>
+                </w14:glow>
               </w:rPr>
               <w:t>YI_0N_93P_B2_089</w:t>
             </w:r>
@@ -3058,16 +3578,33 @@
               <w:jc w:val="center"/>
               <w:rPr>
                 <w:rFonts w:ascii="Arial" w:hAnsi="Arial" w:cs="Arial"/>
-                <w:sz w:val="32"/>
-                <w:szCs w:val="32"/>
-              </w:rPr>
-            </w:pPr>
-            <w:r>
-              <w:rPr>
-                <w:rFonts w:ascii="Arial" w:hAnsi="Arial" w:cs="Arial"/>
-                <w:color w:val="000000"/>
-                <w:sz w:val="32"/>
-                <w:szCs w:val="32"/>
+                <w:color w:val="FFFFFF" w:themeColor="background1"/>
+                <w:sz w:val="32"/>
+                <w:szCs w:val="32"/>
+                <w14:glow w14:rad="635000">
+                  <w14:srgbClr w14:val="0070C0"/>
+                </w14:glow>
+                <w14:textOutline w14:w="9525" w14:cap="rnd" w14:cmpd="sng" w14:algn="ctr">
+                  <w14:noFill/>
+                  <w14:prstDash w14:val="solid"/>
+                  <w14:bevel/>
+                </w14:textOutline>
+              </w:rPr>
+            </w:pPr>
+            <w:r>
+              <w:rPr>
+                <w:rFonts w:ascii="Arial" w:hAnsi="Arial" w:cs="Arial"/>
+                <w:color w:val="FFFFFF" w:themeColor="background1"/>
+                <w:sz w:val="32"/>
+                <w:szCs w:val="32"/>
+                <w14:glow w14:rad="635000">
+                  <w14:srgbClr w14:val="0070C0"/>
+                </w14:glow>
+                <w14:textOutline w14:w="9525" w14:cap="rnd" w14:cmpd="sng" w14:algn="ctr">
+                  <w14:noFill/>
+                  <w14:prstDash w14:val="solid"/>
+                  <w14:bevel/>
+                </w14:textOutline>
               </w:rPr>
               <w:t>YI_0N_7.5P_B1_068</w:t>
             </w:r>
@@ -3086,16 +3623,23 @@
               <w:jc w:val="center"/>
               <w:rPr>
                 <w:rFonts w:ascii="Arial" w:hAnsi="Arial" w:cs="Arial"/>
-                <w:sz w:val="32"/>
-                <w:szCs w:val="32"/>
-              </w:rPr>
-            </w:pPr>
-            <w:r>
-              <w:rPr>
-                <w:rFonts w:ascii="Arial" w:hAnsi="Arial" w:cs="Arial"/>
-                <w:color w:val="000000"/>
-                <w:sz w:val="32"/>
-                <w:szCs w:val="32"/>
+                <w:color w:val="000000"/>
+                <w:sz w:val="32"/>
+                <w:szCs w:val="32"/>
+                <w14:glow w14:rad="635000">
+                  <w14:srgbClr w14:val="FFFF00"/>
+                </w14:glow>
+              </w:rPr>
+            </w:pPr>
+            <w:r>
+              <w:rPr>
+                <w:rFonts w:ascii="Arial" w:hAnsi="Arial" w:cs="Arial"/>
+                <w:color w:val="000000"/>
+                <w:sz w:val="32"/>
+                <w:szCs w:val="32"/>
+                <w14:glow w14:rad="635000">
+                  <w14:srgbClr w14:val="FFFF00"/>
+                </w14:glow>
               </w:rPr>
               <w:t>YI_0N_31P_B4_079</w:t>
             </w:r>
@@ -3117,16 +3661,23 @@
               <w:jc w:val="center"/>
               <w:rPr>
                 <w:rFonts w:ascii="Arial" w:hAnsi="Arial" w:cs="Arial"/>
-                <w:sz w:val="32"/>
-                <w:szCs w:val="32"/>
-              </w:rPr>
-            </w:pPr>
-            <w:r>
-              <w:rPr>
-                <w:rFonts w:ascii="Arial" w:hAnsi="Arial" w:cs="Arial"/>
-                <w:color w:val="000000"/>
-                <w:sz w:val="32"/>
-                <w:szCs w:val="32"/>
+                <w:color w:val="000000"/>
+                <w:sz w:val="32"/>
+                <w:szCs w:val="32"/>
+                <w14:glow w14:rad="635000">
+                  <w14:srgbClr w14:val="EE0000"/>
+                </w14:glow>
+              </w:rPr>
+            </w:pPr>
+            <w:r>
+              <w:rPr>
+                <w:rFonts w:ascii="Arial" w:hAnsi="Arial" w:cs="Arial"/>
+                <w:color w:val="000000"/>
+                <w:sz w:val="32"/>
+                <w:szCs w:val="32"/>
+                <w14:glow w14:rad="635000">
+                  <w14:srgbClr w14:val="EE0000"/>
+                </w14:glow>
               </w:rPr>
               <w:t>YI_210N_93P_B3_090</w:t>
             </w:r>
@@ -3164,16 +3715,33 @@
               <w:jc w:val="center"/>
               <w:rPr>
                 <w:rFonts w:ascii="Arial" w:hAnsi="Arial" w:cs="Arial"/>
-                <w:sz w:val="32"/>
-                <w:szCs w:val="32"/>
-              </w:rPr>
-            </w:pPr>
-            <w:r>
-              <w:rPr>
-                <w:rFonts w:ascii="Arial" w:hAnsi="Arial" w:cs="Arial"/>
-                <w:color w:val="000000"/>
-                <w:sz w:val="32"/>
-                <w:szCs w:val="32"/>
+                <w:color w:val="FFFFFF" w:themeColor="background1"/>
+                <w:sz w:val="32"/>
+                <w:szCs w:val="32"/>
+                <w14:glow w14:rad="635000">
+                  <w14:srgbClr w14:val="0070C0"/>
+                </w14:glow>
+                <w14:textOutline w14:w="9525" w14:cap="rnd" w14:cmpd="sng" w14:algn="ctr">
+                  <w14:noFill/>
+                  <w14:prstDash w14:val="solid"/>
+                  <w14:bevel/>
+                </w14:textOutline>
+              </w:rPr>
+            </w:pPr>
+            <w:r>
+              <w:rPr>
+                <w:rFonts w:ascii="Arial" w:hAnsi="Arial" w:cs="Arial"/>
+                <w:color w:val="FFFFFF" w:themeColor="background1"/>
+                <w:sz w:val="32"/>
+                <w:szCs w:val="32"/>
+                <w14:glow w14:rad="635000">
+                  <w14:srgbClr w14:val="0070C0"/>
+                </w14:glow>
+                <w14:textOutline w14:w="9525" w14:cap="rnd" w14:cmpd="sng" w14:algn="ctr">
+                  <w14:noFill/>
+                  <w14:prstDash w14:val="solid"/>
+                  <w14:bevel/>
+                </w14:textOutline>
               </w:rPr>
               <w:t>YI_0N_7.5P_B2_069</w:t>
             </w:r>
@@ -3192,16 +3760,23 @@
               <w:jc w:val="center"/>
               <w:rPr>
                 <w:rFonts w:ascii="Arial" w:hAnsi="Arial" w:cs="Arial"/>
-                <w:sz w:val="32"/>
-                <w:szCs w:val="32"/>
-              </w:rPr>
-            </w:pPr>
-            <w:r>
-              <w:rPr>
-                <w:rFonts w:ascii="Arial" w:hAnsi="Arial" w:cs="Arial"/>
-                <w:color w:val="000000"/>
-                <w:sz w:val="32"/>
-                <w:szCs w:val="32"/>
+                <w:color w:val="000000"/>
+                <w:sz w:val="32"/>
+                <w:szCs w:val="32"/>
+                <w14:glow w14:rad="635000">
+                  <w14:srgbClr w14:val="FFFF00"/>
+                </w14:glow>
+              </w:rPr>
+            </w:pPr>
+            <w:r>
+              <w:rPr>
+                <w:rFonts w:ascii="Arial" w:hAnsi="Arial" w:cs="Arial"/>
+                <w:color w:val="000000"/>
+                <w:sz w:val="32"/>
+                <w:szCs w:val="32"/>
+                <w14:glow w14:rad="635000">
+                  <w14:srgbClr w14:val="FFFF00"/>
+                </w14:glow>
               </w:rPr>
               <w:t>YI_0N_31P_B1_080</w:t>
             </w:r>
@@ -3216,21 +3791,23 @@
               <w:bottom w:val="single" w:sz="24" w:space="0" w:color="auto"/>
               <w:right w:val="single" w:sz="24" w:space="0" w:color="auto"/>
             </w:tcBorders>
-            <w:vAlign w:val="center"/>
-          </w:tcPr>
-          <w:p>
-            <w:pPr>
-              <w:jc w:val="center"/>
-              <w:rPr>
-                <w:rFonts w:ascii="Arial" w:hAnsi="Arial" w:cs="Arial"/>
-                <w:sz w:val="32"/>
-                <w:szCs w:val="32"/>
-              </w:rPr>
-            </w:pPr>
-            <w:r>
-              <w:rPr>
-                <w:rFonts w:ascii="Arial" w:hAnsi="Arial" w:cs="Arial"/>
-                <w:color w:val="000000"/>
+            <w:shd w:val="clear" w:color="auto" w:fill="7030A0"/>
+            <w:vAlign w:val="center"/>
+          </w:tcPr>
+          <w:p>
+            <w:pPr>
+              <w:jc w:val="center"/>
+              <w:rPr>
+                <w:rFonts w:ascii="Arial" w:hAnsi="Arial" w:cs="Arial"/>
+                <w:color w:val="FFFFFF" w:themeColor="background1"/>
+                <w:sz w:val="32"/>
+                <w:szCs w:val="32"/>
+              </w:rPr>
+            </w:pPr>
+            <w:r>
+              <w:rPr>
+                <w:rFonts w:ascii="Arial" w:hAnsi="Arial" w:cs="Arial"/>
+                <w:color w:val="FFFFFF" w:themeColor="background1"/>
                 <w:sz w:val="32"/>
                 <w:szCs w:val="32"/>
               </w:rPr>
@@ -3270,16 +3847,33 @@
               <w:jc w:val="center"/>
               <w:rPr>
                 <w:rFonts w:ascii="Arial" w:hAnsi="Arial" w:cs="Arial"/>
-                <w:sz w:val="32"/>
-                <w:szCs w:val="32"/>
-              </w:rPr>
-            </w:pPr>
-            <w:r>
-              <w:rPr>
-                <w:rFonts w:ascii="Arial" w:hAnsi="Arial" w:cs="Arial"/>
-                <w:color w:val="000000"/>
-                <w:sz w:val="32"/>
-                <w:szCs w:val="32"/>
+                <w:color w:val="FFFFFF" w:themeColor="background1"/>
+                <w:sz w:val="32"/>
+                <w:szCs w:val="32"/>
+                <w14:glow w14:rad="629488">
+                  <w14:srgbClr w14:val="FFFF00"/>
+                </w14:glow>
+                <w14:textOutline w14:w="9525" w14:cap="rnd" w14:cmpd="sng" w14:algn="ctr">
+                  <w14:noFill/>
+                  <w14:prstDash w14:val="solid"/>
+                  <w14:bevel/>
+                </w14:textOutline>
+              </w:rPr>
+            </w:pPr>
+            <w:r>
+              <w:rPr>
+                <w:rFonts w:ascii="Arial" w:hAnsi="Arial" w:cs="Arial"/>
+                <w:color w:val="FFFFFF" w:themeColor="background1"/>
+                <w:sz w:val="32"/>
+                <w:szCs w:val="32"/>
+                <w14:glow w14:rad="635000">
+                  <w14:srgbClr w14:val="0070C0"/>
+                </w14:glow>
+                <w14:textOutline w14:w="9525" w14:cap="rnd" w14:cmpd="sng" w14:algn="ctr">
+                  <w14:noFill/>
+                  <w14:prstDash w14:val="solid"/>
+                  <w14:bevel/>
+                </w14:textOutline>
               </w:rPr>
               <w:t>YI_0N_7.5P_B3_070</w:t>
             </w:r>
@@ -3298,16 +3892,25 @@
               <w:jc w:val="center"/>
               <w:rPr>
                 <w:rFonts w:ascii="Arial" w:hAnsi="Arial" w:cs="Arial"/>
-                <w:sz w:val="32"/>
-                <w:szCs w:val="32"/>
-              </w:rPr>
-            </w:pPr>
-            <w:r>
-              <w:rPr>
-                <w:rFonts w:ascii="Arial" w:hAnsi="Arial" w:cs="Arial"/>
-                <w:color w:val="000000"/>
-                <w:sz w:val="32"/>
-                <w:szCs w:val="32"/>
+                <w:color w:val="000000"/>
+                <w:sz w:val="32"/>
+                <w:szCs w:val="32"/>
+                <w14:glow w14:rad="635000">
+                  <w14:srgbClr w14:val="EE0000">
+                    <w14:alpha w14:val="60000"/>
+                  </w14:srgbClr>
+                </w14:glow>
+              </w:rPr>
+            </w:pPr>
+            <w:r>
+              <w:rPr>
+                <w:rFonts w:ascii="Arial" w:hAnsi="Arial" w:cs="Arial"/>
+                <w:color w:val="FFFFFF" w:themeColor="background1"/>
+                <w:sz w:val="32"/>
+                <w:szCs w:val="32"/>
+                <w14:glow w14:rad="635000">
+                  <w14:schemeClr w14:val="tx1"/>
+                </w14:glow>
               </w:rPr>
               <w:t>YI_0N_62P_B2_081</w:t>
             </w:r>
@@ -3322,21 +3925,23 @@
               <w:bottom w:val="single" w:sz="24" w:space="0" w:color="auto"/>
               <w:right w:val="single" w:sz="24" w:space="0" w:color="auto"/>
             </w:tcBorders>
-            <w:vAlign w:val="center"/>
-          </w:tcPr>
-          <w:p>
-            <w:pPr>
-              <w:jc w:val="center"/>
-              <w:rPr>
-                <w:rFonts w:ascii="Arial" w:hAnsi="Arial" w:cs="Arial"/>
-                <w:sz w:val="32"/>
-                <w:szCs w:val="32"/>
-              </w:rPr>
-            </w:pPr>
-            <w:r>
-              <w:rPr>
-                <w:rFonts w:ascii="Arial" w:hAnsi="Arial" w:cs="Arial"/>
-                <w:color w:val="000000"/>
+            <w:shd w:val="clear" w:color="auto" w:fill="7030A0"/>
+            <w:vAlign w:val="center"/>
+          </w:tcPr>
+          <w:p>
+            <w:pPr>
+              <w:jc w:val="center"/>
+              <w:rPr>
+                <w:rFonts w:ascii="Arial" w:hAnsi="Arial" w:cs="Arial"/>
+                <w:color w:val="FFFFFF" w:themeColor="background1"/>
+                <w:sz w:val="32"/>
+                <w:szCs w:val="32"/>
+              </w:rPr>
+            </w:pPr>
+            <w:r>
+              <w:rPr>
+                <w:rFonts w:ascii="Arial" w:hAnsi="Arial" w:cs="Arial"/>
+                <w:color w:val="FFFFFF" w:themeColor="background1"/>
                 <w:sz w:val="32"/>
                 <w:szCs w:val="32"/>
               </w:rPr>
@@ -3386,6 +3991,9 @@
                 <w:color w:val="000000"/>
                 <w:sz w:val="32"/>
                 <w:szCs w:val="32"/>
+                <w14:glow w14:rad="635000">
+                  <w14:srgbClr w14:val="00B050"/>
+                </w14:glow>
               </w:rPr>
               <w:t>YI_0N_15P_B4_071</w:t>
             </w:r>
@@ -3404,16 +4012,25 @@
               <w:jc w:val="center"/>
               <w:rPr>
                 <w:rFonts w:ascii="Arial" w:hAnsi="Arial" w:cs="Arial"/>
-                <w:sz w:val="32"/>
-                <w:szCs w:val="32"/>
-              </w:rPr>
-            </w:pPr>
-            <w:r>
-              <w:rPr>
-                <w:rFonts w:ascii="Arial" w:hAnsi="Arial" w:cs="Arial"/>
-                <w:color w:val="000000"/>
-                <w:sz w:val="32"/>
-                <w:szCs w:val="32"/>
+                <w:color w:val="000000"/>
+                <w:sz w:val="32"/>
+                <w:szCs w:val="32"/>
+                <w14:glow w14:rad="635000">
+                  <w14:srgbClr w14:val="EE0000">
+                    <w14:alpha w14:val="60000"/>
+                  </w14:srgbClr>
+                </w14:glow>
+              </w:rPr>
+            </w:pPr>
+            <w:r>
+              <w:rPr>
+                <w:rFonts w:ascii="Arial" w:hAnsi="Arial" w:cs="Arial"/>
+                <w:color w:val="FFFFFF" w:themeColor="background1"/>
+                <w:sz w:val="32"/>
+                <w:szCs w:val="32"/>
+                <w14:glow w14:rad="635000">
+                  <w14:schemeClr w14:val="tx1"/>
+                </w14:glow>
               </w:rPr>
               <w:t>YI_0N_62P_B3_082</w:t>
             </w:r>
@@ -3428,21 +4045,23 @@
               <w:bottom w:val="single" w:sz="24" w:space="0" w:color="auto"/>
               <w:right w:val="single" w:sz="24" w:space="0" w:color="auto"/>
             </w:tcBorders>
-            <w:vAlign w:val="center"/>
-          </w:tcPr>
-          <w:p>
-            <w:pPr>
-              <w:jc w:val="center"/>
-              <w:rPr>
-                <w:rFonts w:ascii="Arial" w:hAnsi="Arial" w:cs="Arial"/>
-                <w:sz w:val="32"/>
-                <w:szCs w:val="32"/>
-              </w:rPr>
-            </w:pPr>
-            <w:r>
-              <w:rPr>
-                <w:rFonts w:ascii="Arial" w:hAnsi="Arial" w:cs="Arial"/>
-                <w:color w:val="000000"/>
+            <w:shd w:val="clear" w:color="auto" w:fill="7030A0"/>
+            <w:vAlign w:val="center"/>
+          </w:tcPr>
+          <w:p>
+            <w:pPr>
+              <w:jc w:val="center"/>
+              <w:rPr>
+                <w:rFonts w:ascii="Arial" w:hAnsi="Arial" w:cs="Arial"/>
+                <w:color w:val="FFFFFF" w:themeColor="background1"/>
+                <w:sz w:val="32"/>
+                <w:szCs w:val="32"/>
+              </w:rPr>
+            </w:pPr>
+            <w:r>
+              <w:rPr>
+                <w:rFonts w:ascii="Arial" w:hAnsi="Arial" w:cs="Arial"/>
+                <w:color w:val="FFFFFF" w:themeColor="background1"/>
                 <w:sz w:val="32"/>
                 <w:szCs w:val="32"/>
               </w:rPr>
@@ -3475,21 +4094,23 @@
         <w:tc>
           <w:tcPr>
             <w:tcW w:w="3145" w:type="dxa"/>
-            <w:vAlign w:val="center"/>
-          </w:tcPr>
-          <w:p>
-            <w:pPr>
-              <w:jc w:val="center"/>
-              <w:rPr>
-                <w:rFonts w:ascii="Arial" w:hAnsi="Arial" w:cs="Arial"/>
-                <w:sz w:val="32"/>
-                <w:szCs w:val="32"/>
-              </w:rPr>
-            </w:pPr>
-            <w:r>
-              <w:rPr>
-                <w:rFonts w:ascii="Arial" w:hAnsi="Arial" w:cs="Arial"/>
-                <w:color w:val="000000"/>
+            <w:shd w:val="clear" w:color="auto" w:fill="7030A0"/>
+            <w:vAlign w:val="center"/>
+          </w:tcPr>
+          <w:p>
+            <w:pPr>
+              <w:jc w:val="center"/>
+              <w:rPr>
+                <w:rFonts w:ascii="Arial" w:hAnsi="Arial" w:cs="Arial"/>
+                <w:color w:val="FFFFFF" w:themeColor="background1"/>
+                <w:sz w:val="32"/>
+                <w:szCs w:val="32"/>
+              </w:rPr>
+            </w:pPr>
+            <w:r>
+              <w:rPr>
+                <w:rFonts w:ascii="Arial" w:hAnsi="Arial" w:cs="Arial"/>
+                <w:color w:val="FFFFFF" w:themeColor="background1"/>
                 <w:sz w:val="32"/>
                 <w:szCs w:val="32"/>
               </w:rPr>
@@ -3504,25 +4125,45 @@
             <w:tcBorders>
               <w:right w:val="single" w:sz="24" w:space="0" w:color="auto"/>
             </w:tcBorders>
-            <w:vAlign w:val="center"/>
-          </w:tcPr>
-          <w:p>
-            <w:pPr>
-              <w:jc w:val="center"/>
-              <w:rPr>
-                <w:rFonts w:ascii="Arial" w:hAnsi="Arial" w:cs="Arial"/>
-                <w:sz w:val="32"/>
-                <w:szCs w:val="32"/>
-              </w:rPr>
-            </w:pPr>
-            <w:r>
-              <w:rPr>
-                <w:rFonts w:ascii="Arial" w:hAnsi="Arial" w:cs="Arial"/>
-                <w:color w:val="000000"/>
-                <w:sz w:val="32"/>
-                <w:szCs w:val="32"/>
-              </w:rPr>
-              <w:t>YI_210N_15P_B2_105</w:t>
+            <w:shd w:val="clear" w:color="auto" w:fill="00B050"/>
+            <w:vAlign w:val="center"/>
+          </w:tcPr>
+          <w:p>
+            <w:pPr>
+              <w:jc w:val="center"/>
+              <w:rPr>
+                <w:rFonts w:ascii="Arial" w:hAnsi="Arial" w:cs="Arial"/>
+                <w:sz w:val="32"/>
+                <w:szCs w:val="32"/>
+              </w:rPr>
+            </w:pPr>
+            <w:r>
+              <w:rPr>
+                <w:rFonts w:ascii="Arial" w:hAnsi="Arial" w:cs="Arial"/>
+                <w:color w:val="000000"/>
+                <w:sz w:val="32"/>
+                <w:szCs w:val="32"/>
+              </w:rPr>
+              <w:t>YI_</w:t>
+            </w:r>
+            <w:r>
+              <w:rPr>
+                <w:rFonts w:ascii="Arial" w:hAnsi="Arial" w:cs="Arial"/>
+                <w:color w:val="000000"/>
+                <w:sz w:val="32"/>
+                <w:szCs w:val="32"/>
+                <w:shd w:val="clear" w:color="auto" w:fill="00B050"/>
+              </w:rPr>
+              <w:t>210N_15P_B2</w:t>
+            </w:r>
+            <w:r>
+              <w:rPr>
+                <w:rFonts w:ascii="Arial" w:hAnsi="Arial" w:cs="Arial"/>
+                <w:color w:val="000000"/>
+                <w:sz w:val="32"/>
+                <w:szCs w:val="32"/>
+              </w:rPr>
+              <w:t>_105</w:t>
             </w:r>
           </w:p>
         </w:tc>
@@ -3535,6 +4176,7 @@
               <w:bottom w:val="single" w:sz="24" w:space="0" w:color="auto"/>
               <w:right w:val="single" w:sz="24" w:space="0" w:color="auto"/>
             </w:tcBorders>
+            <w:shd w:val="clear" w:color="auto" w:fill="EE0000"/>
             <w:vAlign w:val="center"/>
           </w:tcPr>
           <w:p>
@@ -3582,21 +4224,23 @@
         <w:tc>
           <w:tcPr>
             <w:tcW w:w="3145" w:type="dxa"/>
-            <w:vAlign w:val="center"/>
-          </w:tcPr>
-          <w:p>
-            <w:pPr>
-              <w:jc w:val="center"/>
-              <w:rPr>
-                <w:rFonts w:ascii="Arial" w:hAnsi="Arial" w:cs="Arial"/>
-                <w:sz w:val="32"/>
-                <w:szCs w:val="32"/>
-              </w:rPr>
-            </w:pPr>
-            <w:r>
-              <w:rPr>
-                <w:rFonts w:ascii="Arial" w:hAnsi="Arial" w:cs="Arial"/>
-                <w:color w:val="000000"/>
+            <w:shd w:val="clear" w:color="auto" w:fill="7030A0"/>
+            <w:vAlign w:val="center"/>
+          </w:tcPr>
+          <w:p>
+            <w:pPr>
+              <w:jc w:val="center"/>
+              <w:rPr>
+                <w:rFonts w:ascii="Arial" w:hAnsi="Arial" w:cs="Arial"/>
+                <w:color w:val="FFFFFF" w:themeColor="background1"/>
+                <w:sz w:val="32"/>
+                <w:szCs w:val="32"/>
+              </w:rPr>
+            </w:pPr>
+            <w:r>
+              <w:rPr>
+                <w:rFonts w:ascii="Arial" w:hAnsi="Arial" w:cs="Arial"/>
+                <w:color w:val="FFFFFF" w:themeColor="background1"/>
                 <w:sz w:val="32"/>
                 <w:szCs w:val="32"/>
               </w:rPr>
@@ -3610,6 +4254,7 @@
             <w:tcBorders>
               <w:right w:val="single" w:sz="24" w:space="0" w:color="auto"/>
             </w:tcBorders>
+            <w:shd w:val="clear" w:color="auto" w:fill="FFFF00"/>
             <w:vAlign w:val="center"/>
           </w:tcPr>
           <w:p>
@@ -3641,6 +4286,7 @@
               <w:bottom w:val="single" w:sz="24" w:space="0" w:color="auto"/>
               <w:right w:val="single" w:sz="24" w:space="0" w:color="auto"/>
             </w:tcBorders>
+            <w:shd w:val="clear" w:color="auto" w:fill="EE0000"/>
             <w:vAlign w:val="center"/>
           </w:tcPr>
           <w:p>
@@ -3688,21 +4334,23 @@
         <w:tc>
           <w:tcPr>
             <w:tcW w:w="3145" w:type="dxa"/>
-            <w:vAlign w:val="center"/>
-          </w:tcPr>
-          <w:p>
-            <w:pPr>
-              <w:jc w:val="center"/>
-              <w:rPr>
-                <w:rFonts w:ascii="Arial" w:hAnsi="Arial" w:cs="Arial"/>
-                <w:sz w:val="32"/>
-                <w:szCs w:val="32"/>
-              </w:rPr>
-            </w:pPr>
-            <w:r>
-              <w:rPr>
-                <w:rFonts w:ascii="Arial" w:hAnsi="Arial" w:cs="Arial"/>
-                <w:color w:val="000000"/>
+            <w:shd w:val="clear" w:color="auto" w:fill="0070C0"/>
+            <w:vAlign w:val="center"/>
+          </w:tcPr>
+          <w:p>
+            <w:pPr>
+              <w:jc w:val="center"/>
+              <w:rPr>
+                <w:rFonts w:ascii="Arial" w:hAnsi="Arial" w:cs="Arial"/>
+                <w:color w:val="FFFFFF" w:themeColor="background1"/>
+                <w:sz w:val="32"/>
+                <w:szCs w:val="32"/>
+              </w:rPr>
+            </w:pPr>
+            <w:r>
+              <w:rPr>
+                <w:rFonts w:ascii="Arial" w:hAnsi="Arial" w:cs="Arial"/>
+                <w:color w:val="FFFFFF" w:themeColor="background1"/>
                 <w:sz w:val="32"/>
                 <w:szCs w:val="32"/>
               </w:rPr>
@@ -3716,6 +4364,7 @@
             <w:tcBorders>
               <w:right w:val="single" w:sz="24" w:space="0" w:color="auto"/>
             </w:tcBorders>
+            <w:shd w:val="clear" w:color="auto" w:fill="FFFF00"/>
             <w:vAlign w:val="center"/>
           </w:tcPr>
           <w:p>
@@ -3747,6 +4396,7 @@
               <w:bottom w:val="single" w:sz="24" w:space="0" w:color="auto"/>
               <w:right w:val="single" w:sz="24" w:space="0" w:color="auto"/>
             </w:tcBorders>
+            <w:shd w:val="clear" w:color="auto" w:fill="EE0000"/>
             <w:vAlign w:val="center"/>
           </w:tcPr>
           <w:p>
@@ -3794,21 +4444,23 @@
         <w:tc>
           <w:tcPr>
             <w:tcW w:w="3145" w:type="dxa"/>
-            <w:vAlign w:val="center"/>
-          </w:tcPr>
-          <w:p>
-            <w:pPr>
-              <w:jc w:val="center"/>
-              <w:rPr>
-                <w:rFonts w:ascii="Arial" w:hAnsi="Arial" w:cs="Arial"/>
-                <w:sz w:val="32"/>
-                <w:szCs w:val="32"/>
-              </w:rPr>
-            </w:pPr>
-            <w:r>
-              <w:rPr>
-                <w:rFonts w:ascii="Arial" w:hAnsi="Arial" w:cs="Arial"/>
-                <w:color w:val="000000"/>
+            <w:shd w:val="clear" w:color="auto" w:fill="0070C0"/>
+            <w:vAlign w:val="center"/>
+          </w:tcPr>
+          <w:p>
+            <w:pPr>
+              <w:jc w:val="center"/>
+              <w:rPr>
+                <w:rFonts w:ascii="Arial" w:hAnsi="Arial" w:cs="Arial"/>
+                <w:color w:val="FFFFFF" w:themeColor="background1"/>
+                <w:sz w:val="32"/>
+                <w:szCs w:val="32"/>
+              </w:rPr>
+            </w:pPr>
+            <w:r>
+              <w:rPr>
+                <w:rFonts w:ascii="Arial" w:hAnsi="Arial" w:cs="Arial"/>
+                <w:color w:val="FFFFFF" w:themeColor="background1"/>
                 <w:sz w:val="32"/>
                 <w:szCs w:val="32"/>
               </w:rPr>
@@ -3822,6 +4474,7 @@
             <w:tcBorders>
               <w:right w:val="single" w:sz="24" w:space="0" w:color="auto"/>
             </w:tcBorders>
+            <w:shd w:val="clear" w:color="auto" w:fill="FFFF00"/>
             <w:vAlign w:val="center"/>
           </w:tcPr>
           <w:p>
@@ -3853,6 +4506,7 @@
               <w:bottom w:val="single" w:sz="24" w:space="0" w:color="auto"/>
               <w:right w:val="single" w:sz="24" w:space="0" w:color="auto"/>
             </w:tcBorders>
+            <w:shd w:val="clear" w:color="auto" w:fill="EE0000"/>
             <w:vAlign w:val="center"/>
           </w:tcPr>
           <w:p>
@@ -3900,21 +4554,23 @@
         <w:tc>
           <w:tcPr>
             <w:tcW w:w="3145" w:type="dxa"/>
-            <w:vAlign w:val="center"/>
-          </w:tcPr>
-          <w:p>
-            <w:pPr>
-              <w:jc w:val="center"/>
-              <w:rPr>
-                <w:rFonts w:ascii="Arial" w:hAnsi="Arial" w:cs="Arial"/>
-                <w:sz w:val="32"/>
-                <w:szCs w:val="32"/>
-              </w:rPr>
-            </w:pPr>
-            <w:r>
-              <w:rPr>
-                <w:rFonts w:ascii="Arial" w:hAnsi="Arial" w:cs="Arial"/>
-                <w:color w:val="000000"/>
+            <w:shd w:val="clear" w:color="auto" w:fill="0070C0"/>
+            <w:vAlign w:val="center"/>
+          </w:tcPr>
+          <w:p>
+            <w:pPr>
+              <w:jc w:val="center"/>
+              <w:rPr>
+                <w:rFonts w:ascii="Arial" w:hAnsi="Arial" w:cs="Arial"/>
+                <w:color w:val="FFFFFF" w:themeColor="background1"/>
+                <w:sz w:val="32"/>
+                <w:szCs w:val="32"/>
+              </w:rPr>
+            </w:pPr>
+            <w:r>
+              <w:rPr>
+                <w:rFonts w:ascii="Arial" w:hAnsi="Arial" w:cs="Arial"/>
+                <w:color w:val="FFFFFF" w:themeColor="background1"/>
                 <w:sz w:val="32"/>
                 <w:szCs w:val="32"/>
               </w:rPr>
@@ -3928,6 +4584,7 @@
             <w:tcBorders>
               <w:right w:val="single" w:sz="24" w:space="0" w:color="auto"/>
             </w:tcBorders>
+            <w:shd w:val="clear" w:color="auto" w:fill="FFFF00"/>
             <w:vAlign w:val="center"/>
           </w:tcPr>
           <w:p>
@@ -3959,6 +4616,7 @@
               <w:bottom w:val="single" w:sz="24" w:space="0" w:color="auto"/>
               <w:right w:val="single" w:sz="24" w:space="0" w:color="auto"/>
             </w:tcBorders>
+            <w:shd w:val="clear" w:color="auto" w:fill="EE0000"/>
             <w:vAlign w:val="center"/>
           </w:tcPr>
           <w:p>
@@ -4006,21 +4664,23 @@
         <w:tc>
           <w:tcPr>
             <w:tcW w:w="3145" w:type="dxa"/>
-            <w:vAlign w:val="center"/>
-          </w:tcPr>
-          <w:p>
-            <w:pPr>
-              <w:jc w:val="center"/>
-              <w:rPr>
-                <w:rFonts w:ascii="Arial" w:hAnsi="Arial" w:cs="Arial"/>
-                <w:sz w:val="32"/>
-                <w:szCs w:val="32"/>
-              </w:rPr>
-            </w:pPr>
-            <w:r>
-              <w:rPr>
-                <w:rFonts w:ascii="Arial" w:hAnsi="Arial" w:cs="Arial"/>
-                <w:color w:val="000000"/>
+            <w:shd w:val="clear" w:color="auto" w:fill="0070C0"/>
+            <w:vAlign w:val="center"/>
+          </w:tcPr>
+          <w:p>
+            <w:pPr>
+              <w:jc w:val="center"/>
+              <w:rPr>
+                <w:rFonts w:ascii="Arial" w:hAnsi="Arial" w:cs="Arial"/>
+                <w:color w:val="FFFFFF" w:themeColor="background1"/>
+                <w:sz w:val="32"/>
+                <w:szCs w:val="32"/>
+              </w:rPr>
+            </w:pPr>
+            <w:r>
+              <w:rPr>
+                <w:rFonts w:ascii="Arial" w:hAnsi="Arial" w:cs="Arial"/>
+                <w:color w:val="FFFFFF" w:themeColor="background1"/>
                 <w:sz w:val="32"/>
                 <w:szCs w:val="32"/>
               </w:rPr>
@@ -4034,6 +4694,7 @@
             <w:tcBorders>
               <w:right w:val="single" w:sz="24" w:space="0" w:color="auto"/>
             </w:tcBorders>
+            <w:shd w:val="clear" w:color="auto" w:fill="FFFF00"/>
             <w:vAlign w:val="center"/>
           </w:tcPr>
           <w:p>
@@ -4067,6 +4728,16 @@
             </w:tcBorders>
             <w:vAlign w:val="center"/>
           </w:tcPr>
+          <w:p>
+            <w:pPr>
+              <w:jc w:val="center"/>
+              <w:rPr>
+                <w:rFonts w:ascii="Arial" w:hAnsi="Arial" w:cs="Arial"/>
+                <w:sz w:val="32"/>
+                <w:szCs w:val="32"/>
+              </w:rPr>
+            </w:pPr>
+          </w:p>
           <w:p>
             <w:pPr>
               <w:jc w:val="center"/>
@@ -4103,21 +4774,23 @@
         <w:tc>
           <w:tcPr>
             <w:tcW w:w="3145" w:type="dxa"/>
-            <w:vAlign w:val="center"/>
-          </w:tcPr>
-          <w:p>
-            <w:pPr>
-              <w:jc w:val="center"/>
-              <w:rPr>
-                <w:rFonts w:ascii="Arial" w:hAnsi="Arial" w:cs="Arial"/>
-                <w:sz w:val="32"/>
-                <w:szCs w:val="32"/>
-              </w:rPr>
-            </w:pPr>
-            <w:r>
-              <w:rPr>
-                <w:rFonts w:ascii="Arial" w:hAnsi="Arial" w:cs="Arial"/>
-                <w:color w:val="000000"/>
+            <w:shd w:val="clear" w:color="auto" w:fill="0070C0"/>
+            <w:vAlign w:val="center"/>
+          </w:tcPr>
+          <w:p>
+            <w:pPr>
+              <w:jc w:val="center"/>
+              <w:rPr>
+                <w:rFonts w:ascii="Arial" w:hAnsi="Arial" w:cs="Arial"/>
+                <w:color w:val="FFFFFF" w:themeColor="background1"/>
+                <w:sz w:val="32"/>
+                <w:szCs w:val="32"/>
+              </w:rPr>
+            </w:pPr>
+            <w:r>
+              <w:rPr>
+                <w:rFonts w:ascii="Arial" w:hAnsi="Arial" w:cs="Arial"/>
+                <w:color w:val="FFFFFF" w:themeColor="background1"/>
                 <w:sz w:val="32"/>
                 <w:szCs w:val="32"/>
               </w:rPr>
@@ -4131,21 +4804,23 @@
             <w:tcBorders>
               <w:right w:val="single" w:sz="24" w:space="0" w:color="auto"/>
             </w:tcBorders>
-            <w:vAlign w:val="center"/>
-          </w:tcPr>
-          <w:p>
-            <w:pPr>
-              <w:jc w:val="center"/>
-              <w:rPr>
-                <w:rFonts w:ascii="Arial" w:hAnsi="Arial" w:cs="Arial"/>
-                <w:sz w:val="32"/>
-                <w:szCs w:val="32"/>
-              </w:rPr>
-            </w:pPr>
-            <w:r>
-              <w:rPr>
-                <w:rFonts w:ascii="Arial" w:hAnsi="Arial" w:cs="Arial"/>
-                <w:color w:val="000000"/>
+            <w:shd w:val="clear" w:color="auto" w:fill="000000" w:themeFill="text1"/>
+            <w:vAlign w:val="center"/>
+          </w:tcPr>
+          <w:p>
+            <w:pPr>
+              <w:jc w:val="center"/>
+              <w:rPr>
+                <w:rFonts w:ascii="Arial" w:hAnsi="Arial" w:cs="Arial"/>
+                <w:color w:val="FFFFFF" w:themeColor="background1"/>
+                <w:sz w:val="32"/>
+                <w:szCs w:val="32"/>
+              </w:rPr>
+            </w:pPr>
+            <w:r>
+              <w:rPr>
+                <w:rFonts w:ascii="Arial" w:hAnsi="Arial" w:cs="Arial"/>
+                <w:color w:val="FFFFFF" w:themeColor="background1"/>
                 <w:sz w:val="32"/>
                 <w:szCs w:val="32"/>
               </w:rPr>
@@ -4200,6 +4875,7 @@
         <w:tc>
           <w:tcPr>
             <w:tcW w:w="3145" w:type="dxa"/>
+            <w:shd w:val="clear" w:color="auto" w:fill="00B050"/>
             <w:vAlign w:val="center"/>
           </w:tcPr>
           <w:p>
@@ -4228,21 +4904,23 @@
             <w:tcBorders>
               <w:right w:val="single" w:sz="24" w:space="0" w:color="auto"/>
             </w:tcBorders>
-            <w:vAlign w:val="center"/>
-          </w:tcPr>
-          <w:p>
-            <w:pPr>
-              <w:jc w:val="center"/>
-              <w:rPr>
-                <w:rFonts w:ascii="Arial" w:hAnsi="Arial" w:cs="Arial"/>
-                <w:sz w:val="32"/>
-                <w:szCs w:val="32"/>
-              </w:rPr>
-            </w:pPr>
-            <w:r>
-              <w:rPr>
-                <w:rFonts w:ascii="Arial" w:hAnsi="Arial" w:cs="Arial"/>
-                <w:color w:val="000000"/>
+            <w:shd w:val="clear" w:color="auto" w:fill="000000" w:themeFill="text1"/>
+            <w:vAlign w:val="center"/>
+          </w:tcPr>
+          <w:p>
+            <w:pPr>
+              <w:jc w:val="center"/>
+              <w:rPr>
+                <w:rFonts w:ascii="Arial" w:hAnsi="Arial" w:cs="Arial"/>
+                <w:color w:val="FFFFFF" w:themeColor="background1"/>
+                <w:sz w:val="32"/>
+                <w:szCs w:val="32"/>
+              </w:rPr>
+            </w:pPr>
+            <w:r>
+              <w:rPr>
+                <w:rFonts w:ascii="Arial" w:hAnsi="Arial" w:cs="Arial"/>
+                <w:color w:val="FFFFFF" w:themeColor="background1"/>
                 <w:sz w:val="32"/>
                 <w:szCs w:val="32"/>
               </w:rPr>
@@ -4297,6 +4975,7 @@
         <w:tc>
           <w:tcPr>
             <w:tcW w:w="3145" w:type="dxa"/>
+            <w:shd w:val="clear" w:color="auto" w:fill="00B050"/>
             <w:vAlign w:val="center"/>
           </w:tcPr>
           <w:p>
@@ -4325,21 +5004,23 @@
             <w:tcBorders>
               <w:right w:val="single" w:sz="24" w:space="0" w:color="auto"/>
             </w:tcBorders>
-            <w:vAlign w:val="center"/>
-          </w:tcPr>
-          <w:p>
-            <w:pPr>
-              <w:jc w:val="center"/>
-              <w:rPr>
-                <w:rFonts w:ascii="Arial" w:hAnsi="Arial" w:cs="Arial"/>
-                <w:sz w:val="32"/>
-                <w:szCs w:val="32"/>
-              </w:rPr>
-            </w:pPr>
-            <w:r>
-              <w:rPr>
-                <w:rFonts w:ascii="Arial" w:hAnsi="Arial" w:cs="Arial"/>
-                <w:color w:val="000000"/>
+            <w:shd w:val="clear" w:color="auto" w:fill="000000" w:themeFill="text1"/>
+            <w:vAlign w:val="center"/>
+          </w:tcPr>
+          <w:p>
+            <w:pPr>
+              <w:jc w:val="center"/>
+              <w:rPr>
+                <w:rFonts w:ascii="Arial" w:hAnsi="Arial" w:cs="Arial"/>
+                <w:color w:val="FFFFFF" w:themeColor="background1"/>
+                <w:sz w:val="32"/>
+                <w:szCs w:val="32"/>
+              </w:rPr>
+            </w:pPr>
+            <w:r>
+              <w:rPr>
+                <w:rFonts w:ascii="Arial" w:hAnsi="Arial" w:cs="Arial"/>
+                <w:color w:val="FFFFFF" w:themeColor="background1"/>
                 <w:sz w:val="32"/>
                 <w:szCs w:val="32"/>
               </w:rPr>
@@ -4394,6 +5075,7 @@
         <w:tc>
           <w:tcPr>
             <w:tcW w:w="3145" w:type="dxa"/>
+            <w:shd w:val="clear" w:color="auto" w:fill="00B050"/>
             <w:vAlign w:val="center"/>
           </w:tcPr>
           <w:p>
@@ -4422,21 +5104,23 @@
             <w:tcBorders>
               <w:right w:val="single" w:sz="24" w:space="0" w:color="auto"/>
             </w:tcBorders>
-            <w:vAlign w:val="center"/>
-          </w:tcPr>
-          <w:p>
-            <w:pPr>
-              <w:jc w:val="center"/>
-              <w:rPr>
-                <w:rFonts w:ascii="Arial" w:hAnsi="Arial" w:cs="Arial"/>
-                <w:sz w:val="32"/>
-                <w:szCs w:val="32"/>
-              </w:rPr>
-            </w:pPr>
-            <w:r>
-              <w:rPr>
-                <w:rFonts w:ascii="Arial" w:hAnsi="Arial" w:cs="Arial"/>
-                <w:color w:val="000000"/>
+            <w:shd w:val="clear" w:color="auto" w:fill="000000" w:themeFill="text1"/>
+            <w:vAlign w:val="center"/>
+          </w:tcPr>
+          <w:p>
+            <w:pPr>
+              <w:jc w:val="center"/>
+              <w:rPr>
+                <w:rFonts w:ascii="Arial" w:hAnsi="Arial" w:cs="Arial"/>
+                <w:color w:val="FFFFFF" w:themeColor="background1"/>
+                <w:sz w:val="32"/>
+                <w:szCs w:val="32"/>
+              </w:rPr>
+            </w:pPr>
+            <w:r>
+              <w:rPr>
+                <w:rFonts w:ascii="Arial" w:hAnsi="Arial" w:cs="Arial"/>
+                <w:color w:val="FFFFFF" w:themeColor="background1"/>
                 <w:sz w:val="32"/>
                 <w:szCs w:val="32"/>
               </w:rPr>
@@ -4491,6 +5175,7 @@
         <w:tc>
           <w:tcPr>
             <w:tcW w:w="3145" w:type="dxa"/>
+            <w:shd w:val="clear" w:color="auto" w:fill="00B050"/>
             <w:vAlign w:val="center"/>
           </w:tcPr>
           <w:p>
@@ -4519,21 +5204,23 @@
             <w:tcBorders>
               <w:right w:val="single" w:sz="24" w:space="0" w:color="auto"/>
             </w:tcBorders>
-            <w:vAlign w:val="center"/>
-          </w:tcPr>
-          <w:p>
-            <w:pPr>
-              <w:jc w:val="center"/>
-              <w:rPr>
-                <w:rFonts w:ascii="Arial" w:hAnsi="Arial" w:cs="Arial"/>
-                <w:sz w:val="32"/>
-                <w:szCs w:val="32"/>
-              </w:rPr>
-            </w:pPr>
-            <w:r>
-              <w:rPr>
-                <w:rFonts w:ascii="Arial" w:hAnsi="Arial" w:cs="Arial"/>
-                <w:color w:val="000000"/>
+            <w:shd w:val="clear" w:color="auto" w:fill="000000" w:themeFill="text1"/>
+            <w:vAlign w:val="center"/>
+          </w:tcPr>
+          <w:p>
+            <w:pPr>
+              <w:jc w:val="center"/>
+              <w:rPr>
+                <w:rFonts w:ascii="Arial" w:hAnsi="Arial" w:cs="Arial"/>
+                <w:color w:val="FFFFFF" w:themeColor="background1"/>
+                <w:sz w:val="32"/>
+                <w:szCs w:val="32"/>
+              </w:rPr>
+            </w:pPr>
+            <w:r>
+              <w:rPr>
+                <w:rFonts w:ascii="Arial" w:hAnsi="Arial" w:cs="Arial"/>
+                <w:color w:val="FFFFFF" w:themeColor="background1"/>
                 <w:sz w:val="32"/>
                 <w:szCs w:val="32"/>
               </w:rPr>

</xml_diff>